<commit_message>
Use real Weka Explorer screenshots and code screenshots in HW1 report
Co-Authored-By: Claude Opus 5.5 <noreply@anthropic.com>
Claude-Session: https://claude.ai/code/session_017iYXtXZXywz6RXBohVVQP8
</commit_message>
<xml_diff>
--- a/hw1/DM_HW1_report.docx
+++ b/hw1/DM_HW1_report.docx
@@ -77,6 +77,126 @@
     </w:p>
     <w:p>
       <w:pPr>
+        <w:spacing w:after="40" w:before="60"/>
+        <w:jc w:val="center"/>
+      </w:pPr>
+      <w:r>
+        <w:drawing>
+          <wp:inline distT="0" distB="0" distL="0" distR="0">
+            <wp:extent cx="5334000" cy="2857500"/>
+            <wp:effectExtent t="0" r="0" b="0" l="0"/>
+            <wp:docPr id="1" name="" descr="" title=""/>
+            <wp:cNvGraphicFramePr>
+              <a:graphicFrameLocks xmlns:a="http://schemas.openxmlformats.org/drawingml/2006/main" noChangeAspect="1"/>
+            </wp:cNvGraphicFramePr>
+            <a:graphic xmlns:a="http://schemas.openxmlformats.org/drawingml/2006/main">
+              <a:graphicData uri="http://schemas.openxmlformats.org/drawingml/2006/picture">
+                <pic:pic xmlns:pic="http://schemas.openxmlformats.org/drawingml/2006/picture">
+                  <pic:nvPicPr>
+                    <pic:cNvPr id="0" name="" descr=""/>
+                    <pic:cNvPicPr>
+                      <a:picLocks noChangeAspect="1" noChangeArrowheads="1"/>
+                    </pic:cNvPicPr>
+                  </pic:nvPicPr>
+                  <pic:blipFill>
+                    <a:blip r:embed="rId7" cstate="none"/>
+                    <a:srcRect/>
+                    <a:stretch>
+                      <a:fillRect/>
+                    </a:stretch>
+                  </pic:blipFill>
+                  <pic:spPr bwMode="auto">
+                    <a:xfrm>
+                      <a:off x="0" y="0"/>
+                      <a:ext cx="5334000" cy="2857500"/>
+                    </a:xfrm>
+                    <a:prstGeom prst="rect">
+                      <a:avLst/>
+                    </a:prstGeom>
+                  </pic:spPr>
+                </pic:pic>
+              </a:graphicData>
+            </a:graphic>
+          </wp:inline>
+        </w:drawing>
+      </w:r>
+    </w:p>
+    <w:p>
+      <w:pPr>
+        <w:spacing w:after="160"/>
+        <w:jc w:val="center"/>
+      </w:pPr>
+      <w:r>
+        <w:rPr>
+          <w:rFonts w:ascii="Times New Roman" w:eastAsia="新細明體" w:hAnsi="Times New Roman"/>
+          <w:sz w:val="18"/>
+          <w:szCs w:val="18"/>
+        </w:rPr>
+        <w:t xml:space="preserve">圖 1　preprocess.py</w:t>
+      </w:r>
+    </w:p>
+    <w:p>
+      <w:pPr>
+        <w:spacing w:after="40" w:before="60"/>
+        <w:jc w:val="center"/>
+      </w:pPr>
+      <w:r>
+        <w:drawing>
+          <wp:inline distT="0" distB="0" distL="0" distR="0">
+            <wp:extent cx="6096000" cy="1981200"/>
+            <wp:effectExtent t="0" r="0" b="0" l="0"/>
+            <wp:docPr id="1" name="" descr="" title=""/>
+            <wp:cNvGraphicFramePr>
+              <a:graphicFrameLocks xmlns:a="http://schemas.openxmlformats.org/drawingml/2006/main" noChangeAspect="1"/>
+            </wp:cNvGraphicFramePr>
+            <a:graphic xmlns:a="http://schemas.openxmlformats.org/drawingml/2006/main">
+              <a:graphicData uri="http://schemas.openxmlformats.org/drawingml/2006/picture">
+                <pic:pic xmlns:pic="http://schemas.openxmlformats.org/drawingml/2006/picture">
+                  <pic:nvPicPr>
+                    <pic:cNvPr id="0" name="" descr=""/>
+                    <pic:cNvPicPr>
+                      <a:picLocks noChangeAspect="1" noChangeArrowheads="1"/>
+                    </pic:cNvPicPr>
+                  </pic:nvPicPr>
+                  <pic:blipFill>
+                    <a:blip r:embed="rId8" cstate="none"/>
+                    <a:srcRect/>
+                    <a:stretch>
+                      <a:fillRect/>
+                    </a:stretch>
+                  </pic:blipFill>
+                  <pic:spPr bwMode="auto">
+                    <a:xfrm>
+                      <a:off x="0" y="0"/>
+                      <a:ext cx="6096000" cy="1981200"/>
+                    </a:xfrm>
+                    <a:prstGeom prst="rect">
+                      <a:avLst/>
+                    </a:prstGeom>
+                  </pic:spPr>
+                </pic:pic>
+              </a:graphicData>
+            </a:graphic>
+          </wp:inline>
+        </w:drawing>
+      </w:r>
+    </w:p>
+    <w:p>
+      <w:pPr>
+        <w:spacing w:after="160"/>
+        <w:jc w:val="center"/>
+      </w:pPr>
+      <w:r>
+        <w:rPr>
+          <w:rFonts w:ascii="Times New Roman" w:eastAsia="新細明體" w:hAnsi="Times New Roman"/>
+          <w:sz w:val="18"/>
+          <w:szCs w:val="18"/>
+        </w:rPr>
+        <w:t xml:space="preserve">圖 2　匯入 Weka 後：每個屬性只有 TRUE 一個值，其餘為缺值</w:t>
+      </w:r>
+    </w:p>
+    <w:p>
+      <w:pPr>
         <w:pStyle w:val="Heading1"/>
       </w:pPr>
       <w:r>
@@ -258,522 +378,52 @@
         <w:t xml:space="preserve">參數：metric = Confidence，minMetric = 0.9，lowerBoundMinSupport = 0.005，numRules = 10，其餘預設。最終 support = 0.005（40 筆）。</w:t>
       </w:r>
     </w:p>
-    <w:tbl>
-      <w:tblPr>
-        <w:tblW w:type="dxa" w:w="9638"/>
-        <w:tblBorders>
-          <w:top w:val="single" w:color="auto" w:sz="4"/>
-          <w:left w:val="single" w:color="auto" w:sz="4"/>
-          <w:bottom w:val="single" w:color="auto" w:sz="4"/>
-          <w:right w:val="single" w:color="auto" w:sz="4"/>
-          <w:insideH w:val="single" w:color="auto" w:sz="4"/>
-          <w:insideV w:val="single" w:color="auto" w:sz="4"/>
-        </w:tblBorders>
-      </w:tblPr>
-      <w:tblGrid>
-        <w:gridCol w:w="9638"/>
-      </w:tblGrid>
-      <w:tr>
-        <w:tc>
-          <w:tcPr>
-            <w:tcW w:type="dxa" w:w="9638"/>
-            <w:tcBorders>
-              <w:top w:val="single" w:color="000000" w:sz="4"/>
-              <w:left w:val="single" w:color="000000" w:sz="4"/>
-              <w:bottom w:val="single" w:color="000000" w:sz="4"/>
-              <w:right w:val="single" w:color="000000" w:sz="4"/>
-            </w:tcBorders>
-            <w:tcMar>
-              <w:top w:type="dxa" w:w="60"/>
-              <w:left w:type="dxa" w:w="100"/>
-              <w:bottom w:type="dxa" w:w="60"/>
-              <w:right w:type="dxa" w:w="100"/>
-            </w:tcMar>
-          </w:tcPr>
-          <w:p>
-            <w:pPr>
-              <w:spacing w:after="0" w:line="220"/>
-            </w:pPr>
-            <w:r>
-              <w:rPr>
-                <w:rFonts w:ascii="Consolas" w:eastAsia="新細明體" w:hAnsi="Consolas"/>
-                <w:sz w:val="14"/>
-                <w:szCs w:val="14"/>
-              </w:rPr>
-              <w:t xml:space="preserve">Apriori</w:t>
-            </w:r>
-          </w:p>
-          <w:p>
-            <w:pPr>
-              <w:spacing w:after="0" w:line="220"/>
-            </w:pPr>
-            <w:r>
-              <w:rPr>
-                <w:rFonts w:ascii="Consolas" w:eastAsia="新細明體" w:hAnsi="Consolas"/>
-                <w:sz w:val="14"/>
-                <w:szCs w:val="14"/>
-              </w:rPr>
-              <w:t xml:space="preserve">=======</w:t>
-            </w:r>
-          </w:p>
-          <w:p>
-            <w:pPr>
-              <w:spacing w:after="0" w:line="220"/>
-            </w:pPr>
-            <w:r>
-              <w:rPr>
-                <w:rFonts w:ascii="Consolas" w:eastAsia="新細明體" w:hAnsi="Consolas"/>
-                <w:sz w:val="14"/>
-                <w:szCs w:val="14"/>
-              </w:rPr>
-              <w:t xml:space="preserve"> </w:t>
-            </w:r>
-          </w:p>
-          <w:p>
-            <w:pPr>
-              <w:spacing w:after="0" w:line="220"/>
-            </w:pPr>
-            <w:r>
-              <w:rPr>
-                <w:rFonts w:ascii="Consolas" w:eastAsia="新細明體" w:hAnsi="Consolas"/>
-                <w:sz w:val="14"/>
-                <w:szCs w:val="14"/>
-              </w:rPr>
-              <w:t xml:space="preserve">Minimum support: 0 (40 instances)</w:t>
-            </w:r>
-          </w:p>
-          <w:p>
-            <w:pPr>
-              <w:spacing w:after="0" w:line="220"/>
-            </w:pPr>
-            <w:r>
-              <w:rPr>
-                <w:rFonts w:ascii="Consolas" w:eastAsia="新細明體" w:hAnsi="Consolas"/>
-                <w:sz w:val="14"/>
-                <w:szCs w:val="14"/>
-              </w:rPr>
-              <w:t xml:space="preserve">Minimum metric &lt;confidence&gt;: 0.9</w:t>
-            </w:r>
-          </w:p>
-          <w:p>
-            <w:pPr>
-              <w:spacing w:after="0" w:line="220"/>
-            </w:pPr>
-            <w:r>
-              <w:rPr>
-                <w:rFonts w:ascii="Consolas" w:eastAsia="新細明體" w:hAnsi="Consolas"/>
-                <w:sz w:val="14"/>
-                <w:szCs w:val="14"/>
-              </w:rPr>
-              <w:t xml:space="preserve">Number of cycles performed: 20</w:t>
-            </w:r>
-          </w:p>
-          <w:p>
-            <w:pPr>
-              <w:spacing w:after="0" w:line="220"/>
-            </w:pPr>
-            <w:r>
-              <w:rPr>
-                <w:rFonts w:ascii="Consolas" w:eastAsia="新細明體" w:hAnsi="Consolas"/>
-                <w:sz w:val="14"/>
-                <w:szCs w:val="14"/>
-              </w:rPr>
-              <w:t xml:space="preserve"> </w:t>
-            </w:r>
-          </w:p>
-          <w:p>
-            <w:pPr>
-              <w:spacing w:after="0" w:line="220"/>
-            </w:pPr>
-            <w:r>
-              <w:rPr>
-                <w:rFonts w:ascii="Consolas" w:eastAsia="新細明體" w:hAnsi="Consolas"/>
-                <w:sz w:val="14"/>
-                <w:szCs w:val="14"/>
-              </w:rPr>
-              <w:t xml:space="preserve">Generated sets of large itemsets:</w:t>
-            </w:r>
-          </w:p>
-          <w:p>
-            <w:pPr>
-              <w:spacing w:after="0" w:line="220"/>
-            </w:pPr>
-            <w:r>
-              <w:rPr>
-                <w:rFonts w:ascii="Consolas" w:eastAsia="新細明體" w:hAnsi="Consolas"/>
-                <w:sz w:val="14"/>
-                <w:szCs w:val="14"/>
-              </w:rPr>
-              <w:t xml:space="preserve"> </w:t>
-            </w:r>
-          </w:p>
-          <w:p>
-            <w:pPr>
-              <w:spacing w:after="0" w:line="220"/>
-            </w:pPr>
-            <w:r>
-              <w:rPr>
-                <w:rFonts w:ascii="Consolas" w:eastAsia="新細明體" w:hAnsi="Consolas"/>
-                <w:sz w:val="14"/>
-                <w:szCs w:val="14"/>
-              </w:rPr>
-              <w:t xml:space="preserve">Size of set of large itemsets L(1): 120</w:t>
-            </w:r>
-          </w:p>
-          <w:p>
-            <w:pPr>
-              <w:spacing w:after="0" w:line="220"/>
-            </w:pPr>
-            <w:r>
-              <w:rPr>
-                <w:rFonts w:ascii="Consolas" w:eastAsia="新細明體" w:hAnsi="Consolas"/>
-                <w:sz w:val="14"/>
-                <w:szCs w:val="14"/>
-              </w:rPr>
-              <w:t xml:space="preserve"> </w:t>
-            </w:r>
-          </w:p>
-          <w:p>
-            <w:pPr>
-              <w:spacing w:after="0" w:line="220"/>
-            </w:pPr>
-            <w:r>
-              <w:rPr>
-                <w:rFonts w:ascii="Consolas" w:eastAsia="新細明體" w:hAnsi="Consolas"/>
-                <w:sz w:val="14"/>
-                <w:szCs w:val="14"/>
-              </w:rPr>
-              <w:t xml:space="preserve">Size of set of large itemsets L(2): 2933</w:t>
-            </w:r>
-          </w:p>
-          <w:p>
-            <w:pPr>
-              <w:spacing w:after="0" w:line="220"/>
-            </w:pPr>
-            <w:r>
-              <w:rPr>
-                <w:rFonts w:ascii="Consolas" w:eastAsia="新細明體" w:hAnsi="Consolas"/>
-                <w:sz w:val="14"/>
-                <w:szCs w:val="14"/>
-              </w:rPr>
-              <w:t xml:space="preserve"> </w:t>
-            </w:r>
-          </w:p>
-          <w:p>
-            <w:pPr>
-              <w:spacing w:after="0" w:line="220"/>
-            </w:pPr>
-            <w:r>
-              <w:rPr>
-                <w:rFonts w:ascii="Consolas" w:eastAsia="新細明體" w:hAnsi="Consolas"/>
-                <w:sz w:val="14"/>
-                <w:szCs w:val="14"/>
-              </w:rPr>
-              <w:t xml:space="preserve">Size of set of large itemsets L(3): 8685</w:t>
-            </w:r>
-          </w:p>
-          <w:p>
-            <w:pPr>
-              <w:spacing w:after="0" w:line="220"/>
-            </w:pPr>
-            <w:r>
-              <w:rPr>
-                <w:rFonts w:ascii="Consolas" w:eastAsia="新細明體" w:hAnsi="Consolas"/>
-                <w:sz w:val="14"/>
-                <w:szCs w:val="14"/>
-              </w:rPr>
-              <w:t xml:space="preserve"> </w:t>
-            </w:r>
-          </w:p>
-          <w:p>
-            <w:pPr>
-              <w:spacing w:after="0" w:line="220"/>
-            </w:pPr>
-            <w:r>
-              <w:rPr>
-                <w:rFonts w:ascii="Consolas" w:eastAsia="新細明體" w:hAnsi="Consolas"/>
-                <w:sz w:val="14"/>
-                <w:szCs w:val="14"/>
-              </w:rPr>
-              <w:t xml:space="preserve">Size of set of large itemsets L(4): 7153</w:t>
-            </w:r>
-          </w:p>
-          <w:p>
-            <w:pPr>
-              <w:spacing w:after="0" w:line="220"/>
-            </w:pPr>
-            <w:r>
-              <w:rPr>
-                <w:rFonts w:ascii="Consolas" w:eastAsia="新細明體" w:hAnsi="Consolas"/>
-                <w:sz w:val="14"/>
-                <w:szCs w:val="14"/>
-              </w:rPr>
-              <w:t xml:space="preserve"> </w:t>
-            </w:r>
-          </w:p>
-          <w:p>
-            <w:pPr>
-              <w:spacing w:after="0" w:line="220"/>
-            </w:pPr>
-            <w:r>
-              <w:rPr>
-                <w:rFonts w:ascii="Consolas" w:eastAsia="新細明體" w:hAnsi="Consolas"/>
-                <w:sz w:val="14"/>
-                <w:szCs w:val="14"/>
-              </w:rPr>
-              <w:t xml:space="preserve">Size of set of large itemsets L(5): 2038</w:t>
-            </w:r>
-          </w:p>
-          <w:p>
-            <w:pPr>
-              <w:spacing w:after="0" w:line="220"/>
-            </w:pPr>
-            <w:r>
-              <w:rPr>
-                <w:rFonts w:ascii="Consolas" w:eastAsia="新細明體" w:hAnsi="Consolas"/>
-                <w:sz w:val="14"/>
-                <w:szCs w:val="14"/>
-              </w:rPr>
-              <w:t xml:space="preserve"> </w:t>
-            </w:r>
-          </w:p>
-          <w:p>
-            <w:pPr>
-              <w:spacing w:after="0" w:line="220"/>
-            </w:pPr>
-            <w:r>
-              <w:rPr>
-                <w:rFonts w:ascii="Consolas" w:eastAsia="新細明體" w:hAnsi="Consolas"/>
-                <w:sz w:val="14"/>
-                <w:szCs w:val="14"/>
-              </w:rPr>
-              <w:t xml:space="preserve">Size of set of large itemsets L(6): 155</w:t>
-            </w:r>
-          </w:p>
-          <w:p>
-            <w:pPr>
-              <w:spacing w:after="0" w:line="220"/>
-            </w:pPr>
-            <w:r>
-              <w:rPr>
-                <w:rFonts w:ascii="Consolas" w:eastAsia="新細明體" w:hAnsi="Consolas"/>
-                <w:sz w:val="14"/>
-                <w:szCs w:val="14"/>
-              </w:rPr>
-              <w:t xml:space="preserve"> </w:t>
-            </w:r>
-          </w:p>
-          <w:p>
-            <w:pPr>
-              <w:spacing w:after="0" w:line="220"/>
-            </w:pPr>
-            <w:r>
-              <w:rPr>
-                <w:rFonts w:ascii="Consolas" w:eastAsia="新細明體" w:hAnsi="Consolas"/>
-                <w:sz w:val="14"/>
-                <w:szCs w:val="14"/>
-              </w:rPr>
-              <w:t xml:space="preserve">Best rules found:</w:t>
-            </w:r>
-          </w:p>
-          <w:p>
-            <w:pPr>
-              <w:spacing w:after="0" w:line="220"/>
-            </w:pPr>
-            <w:r>
-              <w:rPr>
-                <w:rFonts w:ascii="Consolas" w:eastAsia="新細明體" w:hAnsi="Consolas"/>
-                <w:sz w:val="14"/>
-                <w:szCs w:val="14"/>
-              </w:rPr>
-              <w:t xml:space="preserve"> </w:t>
-            </w:r>
-          </w:p>
-          <w:p>
-            <w:pPr>
-              <w:spacing w:after="0" w:line="220"/>
-            </w:pPr>
-            <w:r>
-              <w:rPr>
-                <w:rFonts w:ascii="Consolas" w:eastAsia="新細明體" w:hAnsi="Consolas"/>
-                <w:sz w:val="14"/>
-                <w:szCs w:val="14"/>
-              </w:rPr>
-              <w:t xml:space="preserve"> 1. crackers/miscellaneous baked food=TRUE frozen pizza=TRUE pasta sauce=TRUE 48 ==&gt; cheese=TRUE 46    &lt;conf:(0.96)&gt; lift:(5.17) lev:(0) [37] conv:(13.03)</w:t>
-            </w:r>
-          </w:p>
-          <w:p>
-            <w:pPr>
-              <w:spacing w:after="0" w:line="220"/>
-            </w:pPr>
-            <w:r>
-              <w:rPr>
-                <w:rFonts w:ascii="Consolas" w:eastAsia="新細明體" w:hAnsi="Consolas"/>
-                <w:sz w:val="14"/>
-                <w:szCs w:val="14"/>
-              </w:rPr>
-              <w:t xml:space="preserve"> 2. bag snacks=TRUE cheese=TRUE frozen pizza=TRUE hot dogs=TRUE 48 ==&gt; packaged bread/buns/rolls=TRUE 46    &lt;conf:(0.96)&gt; lift:(3.87) lev:(0) [34] conv:(12.04)</w:t>
-            </w:r>
-          </w:p>
-          <w:p>
-            <w:pPr>
-              <w:spacing w:after="0" w:line="220"/>
-            </w:pPr>
-            <w:r>
-              <w:rPr>
-                <w:rFonts w:ascii="Consolas" w:eastAsia="新細明體" w:hAnsi="Consolas"/>
-                <w:sz w:val="14"/>
-                <w:szCs w:val="14"/>
-              </w:rPr>
-              <w:t xml:space="preserve"> 3. cheese=TRUE cold cereal=TRUE cookies/cones=TRUE fluid milk products=TRUE soft drinks=TRUE 46 ==&gt; packaged bread/buns/rolls=TRUE 44    &lt;conf:(0.96)&gt; lift:(3.87) lev:(0) [32] conv:(11.54)</w:t>
-            </w:r>
-          </w:p>
-          <w:p>
-            <w:pPr>
-              <w:spacing w:after="0" w:line="220"/>
-            </w:pPr>
-            <w:r>
-              <w:rPr>
-                <w:rFonts w:ascii="Consolas" w:eastAsia="新細明體" w:hAnsi="Consolas"/>
-                <w:sz w:val="14"/>
-                <w:szCs w:val="14"/>
-              </w:rPr>
-              <w:t xml:space="preserve"> 4. bag snacks=TRUE cold cereal=TRUE fluid milk products=TRUE salad dressing/sandwich spread=TRUE soft drinks=TRUE 44 ==&gt; packaged bread/buns/rolls=TRUE 42    &lt;conf:(0.95)&gt; lift:(3.86) lev:(0) [31] conv:(11.04)</w:t>
-            </w:r>
-          </w:p>
-          <w:p>
-            <w:pPr>
-              <w:spacing w:after="0" w:line="220"/>
-            </w:pPr>
-            <w:r>
-              <w:rPr>
-                <w:rFonts w:ascii="Consolas" w:eastAsia="新細明體" w:hAnsi="Consolas"/>
-                <w:sz w:val="14"/>
-                <w:szCs w:val="14"/>
-              </w:rPr>
-              <w:t xml:space="preserve"> 5. bag snacks=TRUE crackers/miscellaneous baked food=TRUE fluid milk products=TRUE pasta sauce=TRUE 43 ==&gt; cheese=TRUE 41    &lt;conf:(0.95)&gt; lift:(5.14) lev:(0) [33] conv:(11.68)</w:t>
-            </w:r>
-          </w:p>
-          <w:p>
-            <w:pPr>
-              <w:spacing w:after="0" w:line="220"/>
-            </w:pPr>
-            <w:r>
-              <w:rPr>
-                <w:rFonts w:ascii="Consolas" w:eastAsia="新細明體" w:hAnsi="Consolas"/>
-                <w:sz w:val="14"/>
-                <w:szCs w:val="14"/>
-              </w:rPr>
-              <w:t xml:space="preserve"> 6. dry dinner mixes=TRUE eggs=TRUE packaged bread/buns/rolls=TRUE refrigerated juices/drinks=TRUE 42 ==&gt; fluid milk products=TRUE 40    &lt;conf:(0.95)&gt; lift:(3.52) lev:(0) [28] conv:(10.21)</w:t>
-            </w:r>
-          </w:p>
-          <w:p>
-            <w:pPr>
-              <w:spacing w:after="0" w:line="220"/>
-            </w:pPr>
-            <w:r>
-              <w:rPr>
-                <w:rFonts w:ascii="Consolas" w:eastAsia="新細明體" w:hAnsi="Consolas"/>
-                <w:sz w:val="14"/>
-                <w:szCs w:val="14"/>
-              </w:rPr>
-              <w:t xml:space="preserve"> 7. dry dinner mixes=TRUE eggs=TRUE tropical fruit=TRUE 52 ==&gt; fluid milk products=TRUE 49    &lt;conf:(0.94)&gt; lift:(3.48) lev:(0) [34] conv:(9.48)</w:t>
-            </w:r>
-          </w:p>
-          <w:p>
-            <w:pPr>
-              <w:spacing w:after="0" w:line="220"/>
-            </w:pPr>
-            <w:r>
-              <w:rPr>
-                <w:rFonts w:ascii="Consolas" w:eastAsia="新細明體" w:hAnsi="Consolas"/>
-                <w:sz w:val="14"/>
-                <w:szCs w:val="14"/>
-              </w:rPr>
-              <w:t xml:space="preserve"> 8. soup=TRUE tropical fruit=TRUE yogurt=TRUE 50 ==&gt; fluid milk products=TRUE 47    &lt;conf:(0.94)&gt; lift:(3.47) lev:(0) [33] conv:(9.11)</w:t>
-            </w:r>
-          </w:p>
-          <w:p>
-            <w:pPr>
-              <w:spacing w:after="0" w:line="220"/>
-            </w:pPr>
-            <w:r>
-              <w:rPr>
-                <w:rFonts w:ascii="Consolas" w:eastAsia="新細明體" w:hAnsi="Consolas"/>
-                <w:sz w:val="14"/>
-                <w:szCs w:val="14"/>
-              </w:rPr>
-              <w:t xml:space="preserve"> 9. cold cereal=TRUE eggs=TRUE soft drinks=TRUE tropical fruit=TRUE 50 ==&gt; fluid milk products=TRUE 47    &lt;conf:(0.94)&gt; lift:(3.47) lev:(0) [33] conv:(9.11)</w:t>
-            </w:r>
-          </w:p>
-          <w:p>
-            <w:pPr>
-              <w:spacing w:after="0" w:line="220"/>
-            </w:pPr>
-            <w:r>
-              <w:rPr>
-                <w:rFonts w:ascii="Consolas" w:eastAsia="新細明體" w:hAnsi="Consolas"/>
-                <w:sz w:val="14"/>
-                <w:szCs w:val="14"/>
-              </w:rPr>
-              <w:t xml:space="preserve">10. canned juices=TRUE dry dinner mixes=TRUE eggs=TRUE 49 ==&gt; fluid milk products=TRUE 46    &lt;conf:(0.94)&gt; lift:(3.47) lev:(0) [32] conv:(8.93)</w:t>
-            </w:r>
-          </w:p>
-          <w:p>
-            <w:pPr>
-              <w:spacing w:after="0" w:line="220"/>
-            </w:pPr>
-            <w:r>
-              <w:rPr>
-                <w:rFonts w:ascii="Consolas" w:eastAsia="新細明體" w:hAnsi="Consolas"/>
-                <w:sz w:val="14"/>
-                <w:szCs w:val="14"/>
-              </w:rPr>
-              <w:t xml:space="preserve"> </w:t>
-            </w:r>
-          </w:p>
-          <w:p>
-            <w:pPr>
-              <w:spacing w:after="0" w:line="220"/>
-            </w:pPr>
-            <w:r>
-              <w:rPr>
-                <w:rFonts w:ascii="Consolas" w:eastAsia="新細明體" w:hAnsi="Consolas"/>
-                <w:sz w:val="14"/>
-                <w:szCs w:val="14"/>
-              </w:rPr>
-              <w:t xml:space="preserve">=== Evaluation ===</w:t>
-            </w:r>
-          </w:p>
-          <w:p>
-            <w:pPr>
-              <w:spacing w:after="0" w:line="220"/>
-            </w:pPr>
-            <w:r>
-              <w:rPr>
-                <w:rFonts w:ascii="Consolas" w:eastAsia="新細明體" w:hAnsi="Consolas"/>
-                <w:sz w:val="14"/>
-                <w:szCs w:val="14"/>
-              </w:rPr>
-              <w:t xml:space="preserve"> </w:t>
-            </w:r>
-          </w:p>
-          <w:p>
-            <w:pPr>
-              <w:spacing w:after="0" w:line="220"/>
-            </w:pPr>
-            <w:r>
-              <w:rPr>
-                <w:rFonts w:ascii="Consolas" w:eastAsia="新細明體" w:hAnsi="Consolas"/>
-                <w:sz w:val="14"/>
-                <w:szCs w:val="14"/>
-              </w:rPr>
-              <w:t xml:space="preserve">Elapsed time: 27.647s</w:t>
-            </w:r>
-          </w:p>
-        </w:tc>
-      </w:tr>
-    </w:tbl>
+    <w:p>
+      <w:pPr>
+        <w:spacing w:after="40" w:before="60"/>
+        <w:jc w:val="center"/>
+      </w:pPr>
+      <w:r>
+        <w:drawing>
+          <wp:inline distT="0" distB="0" distL="0" distR="0">
+            <wp:extent cx="6096000" cy="2857500"/>
+            <wp:effectExtent t="0" r="0" b="0" l="0"/>
+            <wp:docPr id="1" name="" descr="" title=""/>
+            <wp:cNvGraphicFramePr>
+              <a:graphicFrameLocks xmlns:a="http://schemas.openxmlformats.org/drawingml/2006/main" noChangeAspect="1"/>
+            </wp:cNvGraphicFramePr>
+            <a:graphic xmlns:a="http://schemas.openxmlformats.org/drawingml/2006/main">
+              <a:graphicData uri="http://schemas.openxmlformats.org/drawingml/2006/picture">
+                <pic:pic xmlns:pic="http://schemas.openxmlformats.org/drawingml/2006/picture">
+                  <pic:nvPicPr>
+                    <pic:cNvPr id="0" name="" descr=""/>
+                    <pic:cNvPicPr>
+                      <a:picLocks noChangeAspect="1" noChangeArrowheads="1"/>
+                    </pic:cNvPicPr>
+                  </pic:nvPicPr>
+                  <pic:blipFill>
+                    <a:blip r:embed="rId9" cstate="none"/>
+                    <a:srcRect/>
+                    <a:stretch>
+                      <a:fillRect/>
+                    </a:stretch>
+                  </pic:blipFill>
+                  <pic:spPr bwMode="auto">
+                    <a:xfrm>
+                      <a:off x="0" y="0"/>
+                      <a:ext cx="6096000" cy="2857500"/>
+                    </a:xfrm>
+                    <a:prstGeom prst="rect">
+                      <a:avLst/>
+                    </a:prstGeom>
+                  </pic:spPr>
+                </pic:pic>
+              </a:graphicData>
+            </a:graphic>
+          </wp:inline>
+        </w:drawing>
+      </w:r>
+    </w:p>
     <w:p>
       <w:pPr>
         <w:spacing w:after="160"/>
@@ -785,7 +435,7 @@
           <w:sz w:val="18"/>
           <w:szCs w:val="18"/>
         </w:rPr>
-        <w:t xml:space="preserve">圖 1　Q3 執行結果</w:t>
+        <w:t xml:space="preserve">圖 3　Q3 執行結果</w:t>
       </w:r>
     </w:p>
     <w:p>
@@ -2583,314 +2233,52 @@
         <w:t xml:space="preserve">參數：metric = Confidence，minMetric = 0，只調整 lowerBoundMinSupport。</w:t>
       </w:r>
     </w:p>
-    <w:tbl>
-      <w:tblPr>
-        <w:tblW w:type="dxa" w:w="9638"/>
-        <w:tblBorders>
-          <w:top w:val="single" w:color="auto" w:sz="4"/>
-          <w:left w:val="single" w:color="auto" w:sz="4"/>
-          <w:bottom w:val="single" w:color="auto" w:sz="4"/>
-          <w:right w:val="single" w:color="auto" w:sz="4"/>
-          <w:insideH w:val="single" w:color="auto" w:sz="4"/>
-          <w:insideV w:val="single" w:color="auto" w:sz="4"/>
-        </w:tblBorders>
-      </w:tblPr>
-      <w:tblGrid>
-        <w:gridCol w:w="9638"/>
-      </w:tblGrid>
-      <w:tr>
-        <w:tc>
-          <w:tcPr>
-            <w:tcW w:type="dxa" w:w="9638"/>
-            <w:tcBorders>
-              <w:top w:val="single" w:color="000000" w:sz="4"/>
-              <w:left w:val="single" w:color="000000" w:sz="4"/>
-              <w:bottom w:val="single" w:color="000000" w:sz="4"/>
-              <w:right w:val="single" w:color="000000" w:sz="4"/>
-            </w:tcBorders>
-            <w:tcMar>
-              <w:top w:type="dxa" w:w="60"/>
-              <w:left w:type="dxa" w:w="100"/>
-              <w:bottom w:type="dxa" w:w="60"/>
-              <w:right w:type="dxa" w:w="100"/>
-            </w:tcMar>
-          </w:tcPr>
-          <w:p>
-            <w:pPr>
-              <w:spacing w:after="0" w:line="220"/>
-            </w:pPr>
-            <w:r>
-              <w:rPr>
-                <w:rFonts w:ascii="Consolas" w:eastAsia="新細明體" w:hAnsi="Consolas"/>
-                <w:sz w:val="14"/>
-                <w:szCs w:val="14"/>
-              </w:rPr>
-              <w:t xml:space="preserve">Apriori</w:t>
-            </w:r>
-          </w:p>
-          <w:p>
-            <w:pPr>
-              <w:spacing w:after="0" w:line="220"/>
-            </w:pPr>
-            <w:r>
-              <w:rPr>
-                <w:rFonts w:ascii="Consolas" w:eastAsia="新細明體" w:hAnsi="Consolas"/>
-                <w:sz w:val="14"/>
-                <w:szCs w:val="14"/>
-              </w:rPr>
-              <w:t xml:space="preserve">=======</w:t>
-            </w:r>
-          </w:p>
-          <w:p>
-            <w:pPr>
-              <w:spacing w:after="0" w:line="220"/>
-            </w:pPr>
-            <w:r>
-              <w:rPr>
-                <w:rFonts w:ascii="Consolas" w:eastAsia="新細明體" w:hAnsi="Consolas"/>
-                <w:sz w:val="14"/>
-                <w:szCs w:val="14"/>
-              </w:rPr>
-              <w:t xml:space="preserve"> </w:t>
-            </w:r>
-          </w:p>
-          <w:p>
-            <w:pPr>
-              <w:spacing w:after="0" w:line="220"/>
-            </w:pPr>
-            <w:r>
-              <w:rPr>
-                <w:rFonts w:ascii="Consolas" w:eastAsia="新細明體" w:hAnsi="Consolas"/>
-                <w:sz w:val="14"/>
-                <w:szCs w:val="14"/>
-              </w:rPr>
-              <w:t xml:space="preserve">Minimum support: 0.12 (952 instances)</w:t>
-            </w:r>
-          </w:p>
-          <w:p>
-            <w:pPr>
-              <w:spacing w:after="0" w:line="220"/>
-            </w:pPr>
-            <w:r>
-              <w:rPr>
-                <w:rFonts w:ascii="Consolas" w:eastAsia="新細明體" w:hAnsi="Consolas"/>
-                <w:sz w:val="14"/>
-                <w:szCs w:val="14"/>
-              </w:rPr>
-              <w:t xml:space="preserve">Minimum metric &lt;confidence&gt;: 0</w:t>
-            </w:r>
-          </w:p>
-          <w:p>
-            <w:pPr>
-              <w:spacing w:after="0" w:line="220"/>
-            </w:pPr>
-            <w:r>
-              <w:rPr>
-                <w:rFonts w:ascii="Consolas" w:eastAsia="新細明體" w:hAnsi="Consolas"/>
-                <w:sz w:val="14"/>
-                <w:szCs w:val="14"/>
-              </w:rPr>
-              <w:t xml:space="preserve">Number of cycles performed: 18</w:t>
-            </w:r>
-          </w:p>
-          <w:p>
-            <w:pPr>
-              <w:spacing w:after="0" w:line="220"/>
-            </w:pPr>
-            <w:r>
-              <w:rPr>
-                <w:rFonts w:ascii="Consolas" w:eastAsia="新細明體" w:hAnsi="Consolas"/>
-                <w:sz w:val="14"/>
-                <w:szCs w:val="14"/>
-              </w:rPr>
-              <w:t xml:space="preserve"> </w:t>
-            </w:r>
-          </w:p>
-          <w:p>
-            <w:pPr>
-              <w:spacing w:after="0" w:line="220"/>
-            </w:pPr>
-            <w:r>
-              <w:rPr>
-                <w:rFonts w:ascii="Consolas" w:eastAsia="新細明體" w:hAnsi="Consolas"/>
-                <w:sz w:val="14"/>
-                <w:szCs w:val="14"/>
-              </w:rPr>
-              <w:t xml:space="preserve">Generated sets of large itemsets:</w:t>
-            </w:r>
-          </w:p>
-          <w:p>
-            <w:pPr>
-              <w:spacing w:after="0" w:line="220"/>
-            </w:pPr>
-            <w:r>
-              <w:rPr>
-                <w:rFonts w:ascii="Consolas" w:eastAsia="新細明體" w:hAnsi="Consolas"/>
-                <w:sz w:val="14"/>
-                <w:szCs w:val="14"/>
-              </w:rPr>
-              <w:t xml:space="preserve"> </w:t>
-            </w:r>
-          </w:p>
-          <w:p>
-            <w:pPr>
-              <w:spacing w:after="0" w:line="220"/>
-            </w:pPr>
-            <w:r>
-              <w:rPr>
-                <w:rFonts w:ascii="Consolas" w:eastAsia="新細明體" w:hAnsi="Consolas"/>
-                <w:sz w:val="14"/>
-                <w:szCs w:val="14"/>
-              </w:rPr>
-              <w:t xml:space="preserve">Size of set of large itemsets L(1): 8</w:t>
-            </w:r>
-          </w:p>
-          <w:p>
-            <w:pPr>
-              <w:spacing w:after="0" w:line="220"/>
-            </w:pPr>
-            <w:r>
-              <w:rPr>
-                <w:rFonts w:ascii="Consolas" w:eastAsia="新細明體" w:hAnsi="Consolas"/>
-                <w:sz w:val="14"/>
-                <w:szCs w:val="14"/>
-              </w:rPr>
-              <w:t xml:space="preserve"> </w:t>
-            </w:r>
-          </w:p>
-          <w:p>
-            <w:pPr>
-              <w:spacing w:after="0" w:line="220"/>
-            </w:pPr>
-            <w:r>
-              <w:rPr>
-                <w:rFonts w:ascii="Consolas" w:eastAsia="新細明體" w:hAnsi="Consolas"/>
-                <w:sz w:val="14"/>
-                <w:szCs w:val="14"/>
-              </w:rPr>
-              <w:t xml:space="preserve">Size of set of large itemsets L(2): 1</w:t>
-            </w:r>
-          </w:p>
-          <w:p>
-            <w:pPr>
-              <w:spacing w:after="0" w:line="220"/>
-            </w:pPr>
-            <w:r>
-              <w:rPr>
-                <w:rFonts w:ascii="Consolas" w:eastAsia="新細明體" w:hAnsi="Consolas"/>
-                <w:sz w:val="14"/>
-                <w:szCs w:val="14"/>
-              </w:rPr>
-              <w:t xml:space="preserve"> </w:t>
-            </w:r>
-          </w:p>
-          <w:p>
-            <w:pPr>
-              <w:spacing w:after="0" w:line="220"/>
-            </w:pPr>
-            <w:r>
-              <w:rPr>
-                <w:rFonts w:ascii="Consolas" w:eastAsia="新細明體" w:hAnsi="Consolas"/>
-                <w:sz w:val="14"/>
-                <w:szCs w:val="14"/>
-              </w:rPr>
-              <w:t xml:space="preserve">Best rules found:</w:t>
-            </w:r>
-          </w:p>
-          <w:p>
-            <w:pPr>
-              <w:spacing w:after="0" w:line="220"/>
-            </w:pPr>
-            <w:r>
-              <w:rPr>
-                <w:rFonts w:ascii="Consolas" w:eastAsia="新細明體" w:hAnsi="Consolas"/>
-                <w:sz w:val="14"/>
-                <w:szCs w:val="14"/>
-              </w:rPr>
-              <w:t xml:space="preserve"> </w:t>
-            </w:r>
-          </w:p>
-          <w:p>
-            <w:pPr>
-              <w:spacing w:after="0" w:line="220"/>
-            </w:pPr>
-            <w:r>
-              <w:rPr>
-                <w:rFonts w:ascii="Consolas" w:eastAsia="新細明體" w:hAnsi="Consolas"/>
-                <w:sz w:val="14"/>
-                <w:szCs w:val="14"/>
-              </w:rPr>
-              <w:t xml:space="preserve"> 1. packaged bread/buns/rolls=TRUE 1979 ==&gt; fluid milk products=TRUE 957    &lt;conf:(0.48)&gt; lift:(1.79) lev:(0.05) [421] conv:(1.41)</w:t>
-            </w:r>
-          </w:p>
-          <w:p>
-            <w:pPr>
-              <w:spacing w:after="0" w:line="220"/>
-            </w:pPr>
-            <w:r>
-              <w:rPr>
-                <w:rFonts w:ascii="Consolas" w:eastAsia="新細明體" w:hAnsi="Consolas"/>
-                <w:sz w:val="14"/>
-                <w:szCs w:val="14"/>
-              </w:rPr>
-              <w:t xml:space="preserve"> 2. fluid milk products=TRUE 2167 ==&gt; packaged bread/buns/rolls=TRUE 957    &lt;conf:(0.44)&gt; lift:(1.79) lev:(0.05) [421] conv:(1.35)</w:t>
-            </w:r>
-          </w:p>
-          <w:p>
-            <w:pPr>
-              <w:spacing w:after="0" w:line="220"/>
-            </w:pPr>
-            <w:r>
-              <w:rPr>
-                <w:rFonts w:ascii="Consolas" w:eastAsia="新細明體" w:hAnsi="Consolas"/>
-                <w:sz w:val="14"/>
-                <w:szCs w:val="14"/>
-              </w:rPr>
-              <w:t xml:space="preserve"> </w:t>
-            </w:r>
-          </w:p>
-          <w:p>
-            <w:pPr>
-              <w:spacing w:after="0" w:line="220"/>
-            </w:pPr>
-            <w:r>
-              <w:rPr>
-                <w:rFonts w:ascii="Consolas" w:eastAsia="新細明體" w:hAnsi="Consolas"/>
-                <w:sz w:val="14"/>
-                <w:szCs w:val="14"/>
-              </w:rPr>
-              <w:t xml:space="preserve">=== Evaluation ===</w:t>
-            </w:r>
-          </w:p>
-          <w:p>
-            <w:pPr>
-              <w:spacing w:after="0" w:line="220"/>
-            </w:pPr>
-            <w:r>
-              <w:rPr>
-                <w:rFonts w:ascii="Consolas" w:eastAsia="新細明體" w:hAnsi="Consolas"/>
-                <w:sz w:val="14"/>
-                <w:szCs w:val="14"/>
-              </w:rPr>
-              <w:t xml:space="preserve"> </w:t>
-            </w:r>
-          </w:p>
-          <w:p>
-            <w:pPr>
-              <w:spacing w:after="0" w:line="220"/>
-            </w:pPr>
-            <w:r>
-              <w:rPr>
-                <w:rFonts w:ascii="Consolas" w:eastAsia="新細明體" w:hAnsi="Consolas"/>
-                <w:sz w:val="14"/>
-                <w:szCs w:val="14"/>
-              </w:rPr>
-              <w:t xml:space="preserve">Elapsed time: 0.53s</w:t>
-            </w:r>
-          </w:p>
-        </w:tc>
-      </w:tr>
-    </w:tbl>
+    <w:p>
+      <w:pPr>
+        <w:spacing w:after="40" w:before="60"/>
+        <w:jc w:val="center"/>
+      </w:pPr>
+      <w:r>
+        <w:drawing>
+          <wp:inline distT="0" distB="0" distL="0" distR="0">
+            <wp:extent cx="5334000" cy="2609850"/>
+            <wp:effectExtent t="0" r="0" b="0" l="0"/>
+            <wp:docPr id="1" name="" descr="" title=""/>
+            <wp:cNvGraphicFramePr>
+              <a:graphicFrameLocks xmlns:a="http://schemas.openxmlformats.org/drawingml/2006/main" noChangeAspect="1"/>
+            </wp:cNvGraphicFramePr>
+            <a:graphic xmlns:a="http://schemas.openxmlformats.org/drawingml/2006/main">
+              <a:graphicData uri="http://schemas.openxmlformats.org/drawingml/2006/picture">
+                <pic:pic xmlns:pic="http://schemas.openxmlformats.org/drawingml/2006/picture">
+                  <pic:nvPicPr>
+                    <pic:cNvPr id="0" name="" descr=""/>
+                    <pic:cNvPicPr>
+                      <a:picLocks noChangeAspect="1" noChangeArrowheads="1"/>
+                    </pic:cNvPicPr>
+                  </pic:nvPicPr>
+                  <pic:blipFill>
+                    <a:blip r:embed="rId10" cstate="none"/>
+                    <a:srcRect/>
+                    <a:stretch>
+                      <a:fillRect/>
+                    </a:stretch>
+                  </pic:blipFill>
+                  <pic:spPr bwMode="auto">
+                    <a:xfrm>
+                      <a:off x="0" y="0"/>
+                      <a:ext cx="5334000" cy="2609850"/>
+                    </a:xfrm>
+                    <a:prstGeom prst="rect">
+                      <a:avLst/>
+                    </a:prstGeom>
+                  </pic:spPr>
+                </pic:pic>
+              </a:graphicData>
+            </a:graphic>
+          </wp:inline>
+        </w:drawing>
+      </w:r>
+    </w:p>
     <w:p>
       <w:pPr>
         <w:spacing w:after="160"/>
@@ -2902,109 +2290,55 @@
           <w:sz w:val="18"/>
           <w:szCs w:val="18"/>
         </w:rPr>
-        <w:t xml:space="preserve">圖 2　lowerBoundMinSupport = 0.119（952 筆），仍有 2 條規則</w:t>
-      </w:r>
-    </w:p>
-    <w:tbl>
-      <w:tblPr>
-        <w:tblW w:type="dxa" w:w="9638"/>
-        <w:tblBorders>
-          <w:top w:val="single" w:color="auto" w:sz="4"/>
-          <w:left w:val="single" w:color="auto" w:sz="4"/>
-          <w:bottom w:val="single" w:color="auto" w:sz="4"/>
-          <w:right w:val="single" w:color="auto" w:sz="4"/>
-          <w:insideH w:val="single" w:color="auto" w:sz="4"/>
-          <w:insideV w:val="single" w:color="auto" w:sz="4"/>
-        </w:tblBorders>
-      </w:tblPr>
-      <w:tblGrid>
-        <w:gridCol w:w="9638"/>
-      </w:tblGrid>
-      <w:tr>
-        <w:tc>
-          <w:tcPr>
-            <w:tcW w:type="dxa" w:w="9638"/>
-            <w:tcBorders>
-              <w:top w:val="single" w:color="000000" w:sz="4"/>
-              <w:left w:val="single" w:color="000000" w:sz="4"/>
-              <w:bottom w:val="single" w:color="000000" w:sz="4"/>
-              <w:right w:val="single" w:color="000000" w:sz="4"/>
-            </w:tcBorders>
-            <w:tcMar>
-              <w:top w:type="dxa" w:w="60"/>
-              <w:left w:type="dxa" w:w="100"/>
-              <w:bottom w:type="dxa" w:w="60"/>
-              <w:right w:type="dxa" w:w="100"/>
-            </w:tcMar>
-          </w:tcPr>
-          <w:p>
-            <w:pPr>
-              <w:spacing w:after="0" w:line="220"/>
-            </w:pPr>
-            <w:r>
-              <w:rPr>
-                <w:rFonts w:ascii="Consolas" w:eastAsia="新細明體" w:hAnsi="Consolas"/>
-                <w:sz w:val="14"/>
-                <w:szCs w:val="14"/>
-              </w:rPr>
-              <w:t xml:space="preserve">No large itemsets and rules found!</w:t>
-            </w:r>
-          </w:p>
-          <w:p>
-            <w:pPr>
-              <w:spacing w:after="0" w:line="220"/>
-            </w:pPr>
-            <w:r>
-              <w:rPr>
-                <w:rFonts w:ascii="Consolas" w:eastAsia="新細明體" w:hAnsi="Consolas"/>
-                <w:sz w:val="14"/>
-                <w:szCs w:val="14"/>
-              </w:rPr>
-              <w:t xml:space="preserve"> </w:t>
-            </w:r>
-          </w:p>
-          <w:p>
-            <w:pPr>
-              <w:spacing w:after="0" w:line="220"/>
-            </w:pPr>
-            <w:r>
-              <w:rPr>
-                <w:rFonts w:ascii="Consolas" w:eastAsia="新細明體" w:hAnsi="Consolas"/>
-                <w:sz w:val="14"/>
-                <w:szCs w:val="14"/>
-              </w:rPr>
-              <w:t xml:space="preserve">=== Evaluation ===</w:t>
-            </w:r>
-          </w:p>
-          <w:p>
-            <w:pPr>
-              <w:spacing w:after="0" w:line="220"/>
-            </w:pPr>
-            <w:r>
-              <w:rPr>
-                <w:rFonts w:ascii="Consolas" w:eastAsia="新細明體" w:hAnsi="Consolas"/>
-                <w:sz w:val="14"/>
-                <w:szCs w:val="14"/>
-              </w:rPr>
-              <w:t xml:space="preserve"> </w:t>
-            </w:r>
-          </w:p>
-          <w:p>
-            <w:pPr>
-              <w:spacing w:after="0" w:line="220"/>
-            </w:pPr>
-            <w:r>
-              <w:rPr>
-                <w:rFonts w:ascii="Consolas" w:eastAsia="新細明體" w:hAnsi="Consolas"/>
-                <w:sz w:val="14"/>
-                <w:szCs w:val="14"/>
-              </w:rPr>
-              <w:t xml:space="preserve">Elapsed time: 1.502s</w:t>
-            </w:r>
-          </w:p>
-        </w:tc>
-      </w:tr>
-    </w:tbl>
+        <w:t xml:space="preserve">圖 4　lowerBoundMinSupport = 0.119（952 筆），仍有 2 條規則</w:t>
+      </w:r>
+    </w:p>
+    <w:p>
+      <w:pPr>
+        <w:spacing w:after="40" w:before="60"/>
+        <w:jc w:val="center"/>
+      </w:pPr>
+      <w:r>
+        <w:drawing>
+          <wp:inline distT="0" distB="0" distL="0" distR="0">
+            <wp:extent cx="4191000" cy="1457325"/>
+            <wp:effectExtent t="0" r="0" b="0" l="0"/>
+            <wp:docPr id="1" name="" descr="" title=""/>
+            <wp:cNvGraphicFramePr>
+              <a:graphicFrameLocks xmlns:a="http://schemas.openxmlformats.org/drawingml/2006/main" noChangeAspect="1"/>
+            </wp:cNvGraphicFramePr>
+            <a:graphic xmlns:a="http://schemas.openxmlformats.org/drawingml/2006/main">
+              <a:graphicData uri="http://schemas.openxmlformats.org/drawingml/2006/picture">
+                <pic:pic xmlns:pic="http://schemas.openxmlformats.org/drawingml/2006/picture">
+                  <pic:nvPicPr>
+                    <pic:cNvPr id="0" name="" descr=""/>
+                    <pic:cNvPicPr>
+                      <a:picLocks noChangeAspect="1" noChangeArrowheads="1"/>
+                    </pic:cNvPicPr>
+                  </pic:nvPicPr>
+                  <pic:blipFill>
+                    <a:blip r:embed="rId11" cstate="none"/>
+                    <a:srcRect/>
+                    <a:stretch>
+                      <a:fillRect/>
+                    </a:stretch>
+                  </pic:blipFill>
+                  <pic:spPr bwMode="auto">
+                    <a:xfrm>
+                      <a:off x="0" y="0"/>
+                      <a:ext cx="4191000" cy="1457325"/>
+                    </a:xfrm>
+                    <a:prstGeom prst="rect">
+                      <a:avLst/>
+                    </a:prstGeom>
+                  </pic:spPr>
+                </pic:pic>
+              </a:graphicData>
+            </a:graphic>
+          </wp:inline>
+        </w:drawing>
+      </w:r>
+    </w:p>
     <w:p>
       <w:pPr>
         <w:spacing w:after="160"/>
@@ -3016,7 +2350,7 @@
           <w:sz w:val="18"/>
           <w:szCs w:val="18"/>
         </w:rPr>
-        <w:t xml:space="preserve">圖 3　lowerBoundMinSupport = 0.120（960 筆），找不到規則</w:t>
+        <w:t xml:space="preserve">圖 5　lowerBoundMinSupport = 0.120（960 筆），找不到規則</w:t>
       </w:r>
     </w:p>
     <w:p>
@@ -3098,665 +2432,52 @@
         <w:t xml:space="preserve">130 / 8002 ≈ 0.01625，設 lowerBoundMinSupport = 0.01625（Weka 換算為 130 筆）、minMetric = 0.75、numRules = 1000，在結果中找第一條由 4 項商品組成的規則。</w:t>
       </w:r>
     </w:p>
-    <w:tbl>
-      <w:tblPr>
-        <w:tblW w:type="dxa" w:w="9638"/>
-        <w:tblBorders>
-          <w:top w:val="single" w:color="auto" w:sz="4"/>
-          <w:left w:val="single" w:color="auto" w:sz="4"/>
-          <w:bottom w:val="single" w:color="auto" w:sz="4"/>
-          <w:right w:val="single" w:color="auto" w:sz="4"/>
-          <w:insideH w:val="single" w:color="auto" w:sz="4"/>
-          <w:insideV w:val="single" w:color="auto" w:sz="4"/>
-        </w:tblBorders>
-      </w:tblPr>
-      <w:tblGrid>
-        <w:gridCol w:w="9638"/>
-      </w:tblGrid>
-      <w:tr>
-        <w:tc>
-          <w:tcPr>
-            <w:tcW w:type="dxa" w:w="9638"/>
-            <w:tcBorders>
-              <w:top w:val="single" w:color="000000" w:sz="4"/>
-              <w:left w:val="single" w:color="000000" w:sz="4"/>
-              <w:bottom w:val="single" w:color="000000" w:sz="4"/>
-              <w:right w:val="single" w:color="000000" w:sz="4"/>
-            </w:tcBorders>
-            <w:tcMar>
-              <w:top w:type="dxa" w:w="60"/>
-              <w:left w:type="dxa" w:w="100"/>
-              <w:bottom w:type="dxa" w:w="60"/>
-              <w:right w:type="dxa" w:w="100"/>
-            </w:tcMar>
-          </w:tcPr>
-          <w:p>
-            <w:pPr>
-              <w:spacing w:after="0" w:line="220"/>
-            </w:pPr>
-            <w:r>
-              <w:rPr>
-                <w:rFonts w:ascii="Consolas" w:eastAsia="新細明體" w:hAnsi="Consolas"/>
-                <w:sz w:val="14"/>
-                <w:szCs w:val="14"/>
-              </w:rPr>
-              <w:t xml:space="preserve">Apriori</w:t>
-            </w:r>
-          </w:p>
-          <w:p>
-            <w:pPr>
-              <w:spacing w:after="0" w:line="220"/>
-            </w:pPr>
-            <w:r>
-              <w:rPr>
-                <w:rFonts w:ascii="Consolas" w:eastAsia="新細明體" w:hAnsi="Consolas"/>
-                <w:sz w:val="14"/>
-                <w:szCs w:val="14"/>
-              </w:rPr>
-              <w:t xml:space="preserve">=======</w:t>
-            </w:r>
-          </w:p>
-          <w:p>
-            <w:pPr>
-              <w:spacing w:after="0" w:line="220"/>
-            </w:pPr>
-            <w:r>
-              <w:rPr>
-                <w:rFonts w:ascii="Consolas" w:eastAsia="新細明體" w:hAnsi="Consolas"/>
-                <w:sz w:val="14"/>
-                <w:szCs w:val="14"/>
-              </w:rPr>
-              <w:t xml:space="preserve"> </w:t>
-            </w:r>
-          </w:p>
-          <w:p>
-            <w:pPr>
-              <w:spacing w:after="0" w:line="220"/>
-            </w:pPr>
-            <w:r>
-              <w:rPr>
-                <w:rFonts w:ascii="Consolas" w:eastAsia="新細明體" w:hAnsi="Consolas"/>
-                <w:sz w:val="14"/>
-                <w:szCs w:val="14"/>
-              </w:rPr>
-              <w:t xml:space="preserve">Minimum support: 0.02 (130 instances)</w:t>
-            </w:r>
-          </w:p>
-          <w:p>
-            <w:pPr>
-              <w:spacing w:after="0" w:line="220"/>
-            </w:pPr>
-            <w:r>
-              <w:rPr>
-                <w:rFonts w:ascii="Consolas" w:eastAsia="新細明體" w:hAnsi="Consolas"/>
-                <w:sz w:val="14"/>
-                <w:szCs w:val="14"/>
-              </w:rPr>
-              <w:t xml:space="preserve">Minimum metric &lt;confidence&gt;: 0.75</w:t>
-            </w:r>
-          </w:p>
-          <w:p>
-            <w:pPr>
-              <w:spacing w:after="0" w:line="220"/>
-            </w:pPr>
-            <w:r>
-              <w:rPr>
-                <w:rFonts w:ascii="Consolas" w:eastAsia="新細明體" w:hAnsi="Consolas"/>
-                <w:sz w:val="14"/>
-                <w:szCs w:val="14"/>
-              </w:rPr>
-              <w:t xml:space="preserve">Number of cycles performed: 20</w:t>
-            </w:r>
-          </w:p>
-          <w:p>
-            <w:pPr>
-              <w:spacing w:after="0" w:line="220"/>
-            </w:pPr>
-            <w:r>
-              <w:rPr>
-                <w:rFonts w:ascii="Consolas" w:eastAsia="新細明體" w:hAnsi="Consolas"/>
-                <w:sz w:val="14"/>
-                <w:szCs w:val="14"/>
-              </w:rPr>
-              <w:t xml:space="preserve"> </w:t>
-            </w:r>
-          </w:p>
-          <w:p>
-            <w:pPr>
-              <w:spacing w:after="0" w:line="220"/>
-            </w:pPr>
-            <w:r>
-              <w:rPr>
-                <w:rFonts w:ascii="Consolas" w:eastAsia="新細明體" w:hAnsi="Consolas"/>
-                <w:sz w:val="14"/>
-                <w:szCs w:val="14"/>
-              </w:rPr>
-              <w:t xml:space="preserve">Generated sets of large itemsets:</w:t>
-            </w:r>
-          </w:p>
-          <w:p>
-            <w:pPr>
-              <w:spacing w:after="0" w:line="220"/>
-            </w:pPr>
-            <w:r>
-              <w:rPr>
-                <w:rFonts w:ascii="Consolas" w:eastAsia="新細明體" w:hAnsi="Consolas"/>
-                <w:sz w:val="14"/>
-                <w:szCs w:val="14"/>
-              </w:rPr>
-              <w:t xml:space="preserve"> </w:t>
-            </w:r>
-          </w:p>
-          <w:p>
-            <w:pPr>
-              <w:spacing w:after="0" w:line="220"/>
-            </w:pPr>
-            <w:r>
-              <w:rPr>
-                <w:rFonts w:ascii="Consolas" w:eastAsia="新細明體" w:hAnsi="Consolas"/>
-                <w:sz w:val="14"/>
-                <w:szCs w:val="14"/>
-              </w:rPr>
-              <w:t xml:space="preserve">Size of set of large itemsets L(1): 120</w:t>
-            </w:r>
-          </w:p>
-          <w:p>
-            <w:pPr>
-              <w:spacing w:after="0" w:line="220"/>
-            </w:pPr>
-            <w:r>
-              <w:rPr>
-                <w:rFonts w:ascii="Consolas" w:eastAsia="新細明體" w:hAnsi="Consolas"/>
-                <w:sz w:val="14"/>
-                <w:szCs w:val="14"/>
-              </w:rPr>
-              <w:t xml:space="preserve"> </w:t>
-            </w:r>
-          </w:p>
-          <w:p>
-            <w:pPr>
-              <w:spacing w:after="0" w:line="220"/>
-            </w:pPr>
-            <w:r>
-              <w:rPr>
-                <w:rFonts w:ascii="Consolas" w:eastAsia="新細明體" w:hAnsi="Consolas"/>
-                <w:sz w:val="14"/>
-                <w:szCs w:val="14"/>
-              </w:rPr>
-              <w:t xml:space="preserve">Size of set of large itemsets L(2): 497</w:t>
-            </w:r>
-          </w:p>
-          <w:p>
-            <w:pPr>
-              <w:spacing w:after="0" w:line="220"/>
-            </w:pPr>
-            <w:r>
-              <w:rPr>
-                <w:rFonts w:ascii="Consolas" w:eastAsia="新細明體" w:hAnsi="Consolas"/>
-                <w:sz w:val="14"/>
-                <w:szCs w:val="14"/>
-              </w:rPr>
-              <w:t xml:space="preserve"> </w:t>
-            </w:r>
-          </w:p>
-          <w:p>
-            <w:pPr>
-              <w:spacing w:after="0" w:line="220"/>
-            </w:pPr>
-            <w:r>
-              <w:rPr>
-                <w:rFonts w:ascii="Consolas" w:eastAsia="新細明體" w:hAnsi="Consolas"/>
-                <w:sz w:val="14"/>
-                <w:szCs w:val="14"/>
-              </w:rPr>
-              <w:t xml:space="preserve">Size of set of large itemsets L(3): 331</w:t>
-            </w:r>
-          </w:p>
-          <w:p>
-            <w:pPr>
-              <w:spacing w:after="0" w:line="220"/>
-            </w:pPr>
-            <w:r>
-              <w:rPr>
-                <w:rFonts w:ascii="Consolas" w:eastAsia="新細明體" w:hAnsi="Consolas"/>
-                <w:sz w:val="14"/>
-                <w:szCs w:val="14"/>
-              </w:rPr>
-              <w:t xml:space="preserve"> </w:t>
-            </w:r>
-          </w:p>
-          <w:p>
-            <w:pPr>
-              <w:spacing w:after="0" w:line="220"/>
-            </w:pPr>
-            <w:r>
-              <w:rPr>
-                <w:rFonts w:ascii="Consolas" w:eastAsia="新細明體" w:hAnsi="Consolas"/>
-                <w:sz w:val="14"/>
-                <w:szCs w:val="14"/>
-              </w:rPr>
-              <w:t xml:space="preserve">Size of set of large itemsets L(4): 39</w:t>
-            </w:r>
-          </w:p>
-          <w:p>
-            <w:pPr>
-              <w:spacing w:after="0" w:line="220"/>
-            </w:pPr>
-            <w:r>
-              <w:rPr>
-                <w:rFonts w:ascii="Consolas" w:eastAsia="新細明體" w:hAnsi="Consolas"/>
-                <w:sz w:val="14"/>
-                <w:szCs w:val="14"/>
-              </w:rPr>
-              <w:t xml:space="preserve"> </w:t>
-            </w:r>
-          </w:p>
-          <w:p>
-            <w:pPr>
-              <w:spacing w:after="0" w:line="220"/>
-            </w:pPr>
-            <w:r>
-              <w:rPr>
-                <w:rFonts w:ascii="Consolas" w:eastAsia="新細明體" w:hAnsi="Consolas"/>
-                <w:sz w:val="14"/>
-                <w:szCs w:val="14"/>
-              </w:rPr>
-              <w:t xml:space="preserve">Size of set of large itemsets L(5): 1</w:t>
-            </w:r>
-          </w:p>
-          <w:p>
-            <w:pPr>
-              <w:spacing w:after="0" w:line="220"/>
-            </w:pPr>
-            <w:r>
-              <w:rPr>
-                <w:rFonts w:ascii="Consolas" w:eastAsia="新細明體" w:hAnsi="Consolas"/>
-                <w:sz w:val="14"/>
-                <w:szCs w:val="14"/>
-              </w:rPr>
-              <w:t xml:space="preserve"> </w:t>
-            </w:r>
-          </w:p>
-          <w:p>
-            <w:pPr>
-              <w:spacing w:after="0" w:line="220"/>
-            </w:pPr>
-            <w:r>
-              <w:rPr>
-                <w:rFonts w:ascii="Consolas" w:eastAsia="新細明體" w:hAnsi="Consolas"/>
-                <w:sz w:val="14"/>
-                <w:szCs w:val="14"/>
-              </w:rPr>
-              <w:t xml:space="preserve">Best rules found:</w:t>
-            </w:r>
-          </w:p>
-          <w:p>
-            <w:pPr>
-              <w:spacing w:after="0" w:line="220"/>
-            </w:pPr>
-            <w:r>
-              <w:rPr>
-                <w:rFonts w:ascii="Consolas" w:eastAsia="新細明體" w:hAnsi="Consolas"/>
-                <w:sz w:val="14"/>
-                <w:szCs w:val="14"/>
-              </w:rPr>
-              <w:t xml:space="preserve"> </w:t>
-            </w:r>
-          </w:p>
-          <w:p>
-            <w:pPr>
-              <w:spacing w:after="0" w:line="220"/>
-            </w:pPr>
-            <w:r>
-              <w:rPr>
-                <w:rFonts w:ascii="Consolas" w:eastAsia="新細明體" w:hAnsi="Consolas"/>
-                <w:sz w:val="14"/>
-                <w:szCs w:val="14"/>
-              </w:rPr>
-              <w:t xml:space="preserve">  1. canned juices=TRUE eggs=TRUE 160 ==&gt; fluid milk products=TRUE 130    &lt;conf:(0.81)&gt; lift:(3) lev:(0.01) [86] conv:(3.76)</w:t>
-            </w:r>
-          </w:p>
-          <w:p>
-            <w:pPr>
-              <w:spacing w:after="0" w:line="220"/>
-            </w:pPr>
-            <w:r>
-              <w:rPr>
-                <w:rFonts w:ascii="Consolas" w:eastAsia="新細明體" w:hAnsi="Consolas"/>
-                <w:sz w:val="14"/>
-                <w:szCs w:val="14"/>
-              </w:rPr>
-              <w:t xml:space="preserve">  2. cold cereal=TRUE eggs=TRUE 240 ==&gt; fluid milk products=TRUE 192    &lt;conf:(0.8)&gt; lift:(2.95) lev:(0.02) [127] conv:(3.57)</w:t>
-            </w:r>
-          </w:p>
-          <w:p>
-            <w:pPr>
-              <w:spacing w:after="0" w:line="220"/>
-            </w:pPr>
-            <w:r>
-              <w:rPr>
-                <w:rFonts w:ascii="Consolas" w:eastAsia="新細明體" w:hAnsi="Consolas"/>
-                <w:sz w:val="14"/>
-                <w:szCs w:val="14"/>
-              </w:rPr>
-              <w:t xml:space="preserve">  3. bag snacks=TRUE cold cereal=TRUE packaged bread/buns/rolls=TRUE 176 ==&gt; fluid milk products=TRUE 140    &lt;conf:(0.8)&gt; lift:(2.94) lev:(0.01) [92] conv:(3.47)</w:t>
-            </w:r>
-          </w:p>
-          <w:p>
-            <w:pPr>
-              <w:spacing w:after="0" w:line="220"/>
-            </w:pPr>
-            <w:r>
-              <w:rPr>
-                <w:rFonts w:ascii="Consolas" w:eastAsia="新細明體" w:hAnsi="Consolas"/>
-                <w:sz w:val="14"/>
-                <w:szCs w:val="14"/>
-              </w:rPr>
-              <w:t xml:space="preserve">  4. canned juices=TRUE cold cereal=TRUE 186 ==&gt; fluid milk products=TRUE 147    &lt;conf:(0.79)&gt; lift:(2.92) lev:(0.01) [96] conv:(3.39)</w:t>
-            </w:r>
-          </w:p>
-          <w:p>
-            <w:pPr>
-              <w:spacing w:after="0" w:line="220"/>
-            </w:pPr>
-            <w:r>
-              <w:rPr>
-                <w:rFonts w:ascii="Consolas" w:eastAsia="新細明體" w:hAnsi="Consolas"/>
-                <w:sz w:val="14"/>
-                <w:szCs w:val="14"/>
-              </w:rPr>
-              <w:t xml:space="preserve">  5. cheese=TRUE crackers/miscellaneous baked food=TRUE fluid milk products=TRUE 205 ==&gt; packaged bread/buns/rolls=TRUE 162    &lt;conf:(0.79)&gt; lift:(3.2) lev:(0.01) [111] conv:(3.51)</w:t>
-            </w:r>
-          </w:p>
-          <w:p>
-            <w:pPr>
-              <w:spacing w:after="0" w:line="220"/>
-            </w:pPr>
-            <w:r>
-              <w:rPr>
-                <w:rFonts w:ascii="Consolas" w:eastAsia="新細明體" w:hAnsi="Consolas"/>
-                <w:sz w:val="14"/>
-                <w:szCs w:val="14"/>
-              </w:rPr>
-              <w:t xml:space="preserve">  6. cold cereal=TRUE packaged bread/buns/rolls=TRUE soft drinks=TRUE 213 ==&gt; fluid milk products=TRUE 168    &lt;conf:(0.79)&gt; lift:(2.91) lev:(0.01) [110] conv:(3.38)</w:t>
-            </w:r>
-          </w:p>
-          <w:p>
-            <w:pPr>
-              <w:spacing w:after="0" w:line="220"/>
-            </w:pPr>
-            <w:r>
-              <w:rPr>
-                <w:rFonts w:ascii="Consolas" w:eastAsia="新細明體" w:hAnsi="Consolas"/>
-                <w:sz w:val="14"/>
-                <w:szCs w:val="14"/>
-              </w:rPr>
-              <w:t xml:space="preserve">  7. cold cereal=TRUE convenient breakfast/wholesome snacks=TRUE 181 ==&gt; fluid milk products=TRUE 142    &lt;conf:(0.78)&gt; lift:(2.9) lev:(0.01) [92] conv:(3.3)</w:t>
-            </w:r>
-          </w:p>
-          <w:p>
-            <w:pPr>
-              <w:spacing w:after="0" w:line="220"/>
-            </w:pPr>
-            <w:r>
-              <w:rPr>
-                <w:rFonts w:ascii="Consolas" w:eastAsia="新細明體" w:hAnsi="Consolas"/>
-                <w:sz w:val="14"/>
-                <w:szCs w:val="14"/>
-              </w:rPr>
-              <w:t xml:space="preserve">  8. cold cereal=TRUE packaged bread/buns/rolls=TRUE tropical fruit=TRUE 194 ==&gt; fluid milk products=TRUE 152    &lt;conf:(0.78)&gt; lift:(2.89) lev:(0.01) [99] conv:(3.29)</w:t>
-            </w:r>
-          </w:p>
-          <w:p>
-            <w:pPr>
-              <w:spacing w:after="0" w:line="220"/>
-            </w:pPr>
-            <w:r>
-              <w:rPr>
-                <w:rFonts w:ascii="Consolas" w:eastAsia="新細明體" w:hAnsi="Consolas"/>
-                <w:sz w:val="14"/>
-                <w:szCs w:val="14"/>
-              </w:rPr>
-              <w:t xml:space="preserve">  9. bag snacks=TRUE cheese=TRUE fluid milk products=TRUE soft drinks=TRUE 180 ==&gt; packaged bread/buns/rolls=TRUE 141    &lt;conf:(0.78)&gt; lift:(3.17) lev:(0.01) [96] conv:(3.39)</w:t>
-            </w:r>
-          </w:p>
-          <w:p>
-            <w:pPr>
-              <w:spacing w:after="0" w:line="220"/>
-            </w:pPr>
-            <w:r>
-              <w:rPr>
-                <w:rFonts w:ascii="Consolas" w:eastAsia="新細明體" w:hAnsi="Consolas"/>
-                <w:sz w:val="14"/>
-                <w:szCs w:val="14"/>
-              </w:rPr>
-              <w:t xml:space="preserve"> 10. bag snacks=TRUE hot dogs=TRUE 170 ==&gt; packaged bread/buns/rolls=TRUE 133    &lt;conf:(0.78)&gt; lift:(3.16) lev:(0.01) [90] conv:(3.37)</w:t>
-            </w:r>
-          </w:p>
-          <w:p>
-            <w:pPr>
-              <w:spacing w:after="0" w:line="220"/>
-            </w:pPr>
-            <w:r>
-              <w:rPr>
-                <w:rFonts w:ascii="Consolas" w:eastAsia="新細明體" w:hAnsi="Consolas"/>
-                <w:sz w:val="14"/>
-                <w:szCs w:val="14"/>
-              </w:rPr>
-              <w:t xml:space="preserve"> 11. cheese=TRUE cold cereal=TRUE packaged bread/buns/rolls=TRUE 244 ==&gt; fluid milk products=TRUE 190    &lt;conf:(0.78)&gt; lift:(2.88) lev:(0.02) [123] conv:(3.23)</w:t>
-            </w:r>
-          </w:p>
-          <w:p>
-            <w:pPr>
-              <w:spacing w:after="0" w:line="220"/>
-            </w:pPr>
-            <w:r>
-              <w:rPr>
-                <w:rFonts w:ascii="Consolas" w:eastAsia="新細明體" w:hAnsi="Consolas"/>
-                <w:sz w:val="14"/>
-                <w:szCs w:val="14"/>
-              </w:rPr>
-              <w:t xml:space="preserve"> 12. cheese=TRUE hot dogs=TRUE 229 ==&gt; packaged bread/buns/rolls=TRUE 177    &lt;conf:(0.77)&gt; lift:(3.13) lev:(0.02) [120] conv:(3.25)</w:t>
-            </w:r>
-          </w:p>
-          <w:p>
-            <w:pPr>
-              <w:spacing w:after="0" w:line="220"/>
-            </w:pPr>
-            <w:r>
-              <w:rPr>
-                <w:rFonts w:ascii="Consolas" w:eastAsia="新細明體" w:hAnsi="Consolas"/>
-                <w:sz w:val="14"/>
-                <w:szCs w:val="14"/>
-              </w:rPr>
-              <w:t xml:space="preserve"> 13. bag snacks=TRUE beef=TRUE fluid milk products=TRUE 202 ==&gt; packaged bread/buns/rolls=TRUE 156    &lt;conf:(0.77)&gt; lift:(3.12) lev:(0.01) [106] conv:(3.23)</w:t>
-            </w:r>
-          </w:p>
-          <w:p>
-            <w:pPr>
-              <w:spacing w:after="0" w:line="220"/>
-            </w:pPr>
-            <w:r>
-              <w:rPr>
-                <w:rFonts w:ascii="Consolas" w:eastAsia="新細明體" w:hAnsi="Consolas"/>
-                <w:sz w:val="14"/>
-                <w:szCs w:val="14"/>
-              </w:rPr>
-              <w:t xml:space="preserve"> 14. beef=TRUE cold cereal=TRUE packaged bread/buns/rolls=TRUE 178 ==&gt; fluid milk products=TRUE 136    &lt;conf:(0.76)&gt; lift:(2.82) lev:(0.01) [87] conv:(3.02)</w:t>
-            </w:r>
-          </w:p>
-          <w:p>
-            <w:pPr>
-              <w:spacing w:after="0" w:line="220"/>
-            </w:pPr>
-            <w:r>
-              <w:rPr>
-                <w:rFonts w:ascii="Consolas" w:eastAsia="新細明體" w:hAnsi="Consolas"/>
-                <w:sz w:val="14"/>
-                <w:szCs w:val="14"/>
-              </w:rPr>
-              <w:t xml:space="preserve"> 15. cold cereal=TRUE soup=TRUE 182 ==&gt; fluid milk products=TRUE 139    &lt;conf:(0.76)&gt; lift:(2.82) lev:(0.01) [89] conv:(3.02)</w:t>
-            </w:r>
-          </w:p>
-          <w:p>
-            <w:pPr>
-              <w:spacing w:after="0" w:line="220"/>
-            </w:pPr>
-            <w:r>
-              <w:rPr>
-                <w:rFonts w:ascii="Consolas" w:eastAsia="新細明體" w:hAnsi="Consolas"/>
-                <w:sz w:val="14"/>
-                <w:szCs w:val="14"/>
-              </w:rPr>
-              <w:t xml:space="preserve"> 16. fluid milk products=TRUE hot dogs=TRUE 215 ==&gt; packaged bread/buns/rolls=TRUE 164    &lt;conf:(0.76)&gt; lift:(3.08) lev:(0.01) [110] conv:(3.11)</w:t>
-            </w:r>
-          </w:p>
-          <w:p>
-            <w:pPr>
-              <w:spacing w:after="0" w:line="220"/>
-            </w:pPr>
-            <w:r>
-              <w:rPr>
-                <w:rFonts w:ascii="Consolas" w:eastAsia="新細明體" w:hAnsi="Consolas"/>
-                <w:sz w:val="14"/>
-                <w:szCs w:val="14"/>
-              </w:rPr>
-              <w:t xml:space="preserve"> 17. cheese=TRUE cold cereal=TRUE soft drinks=TRUE 180 ==&gt; fluid milk products=TRUE 137    &lt;conf:(0.76)&gt; lift:(2.81) lev:(0.01) [88] conv:(2.98)</w:t>
-            </w:r>
-          </w:p>
-          <w:p>
-            <w:pPr>
-              <w:spacing w:after="0" w:line="220"/>
-            </w:pPr>
-            <w:r>
-              <w:rPr>
-                <w:rFonts w:ascii="Consolas" w:eastAsia="新細明體" w:hAnsi="Consolas"/>
-                <w:sz w:val="14"/>
-                <w:szCs w:val="14"/>
-              </w:rPr>
-              <w:t xml:space="preserve"> 18. eggs=TRUE tropical fruit=TRUE 254 ==&gt; fluid milk products=TRUE 193    &lt;conf:(0.76)&gt; lift:(2.81) lev:(0.02) [124] conv:(2.99)</w:t>
-            </w:r>
-          </w:p>
-          <w:p>
-            <w:pPr>
-              <w:spacing w:after="0" w:line="220"/>
-            </w:pPr>
-            <w:r>
-              <w:rPr>
-                <w:rFonts w:ascii="Consolas" w:eastAsia="新細明體" w:hAnsi="Consolas"/>
-                <w:sz w:val="14"/>
-                <w:szCs w:val="14"/>
-              </w:rPr>
-              <w:t xml:space="preserve"> 19. cold cereal=TRUE refrigerated juices/drinks=TRUE 245 ==&gt; fluid milk products=TRUE 186    &lt;conf:(0.76)&gt; lift:(2.8) lev:(0.01) [119] conv:(2.98)</w:t>
-            </w:r>
-          </w:p>
-          <w:p>
-            <w:pPr>
-              <w:spacing w:after="0" w:line="220"/>
-            </w:pPr>
-            <w:r>
-              <w:rPr>
-                <w:rFonts w:ascii="Consolas" w:eastAsia="新細明體" w:hAnsi="Consolas"/>
-                <w:sz w:val="14"/>
-                <w:szCs w:val="14"/>
-              </w:rPr>
-              <w:t xml:space="preserve"> 20. cold cereal=TRUE tropical fruit=TRUE 285 ==&gt; fluid milk products=TRUE 216    &lt;conf:(0.76)&gt; lift:(2.8) lev:(0.02) [138] conv:(2.97)</w:t>
-            </w:r>
-          </w:p>
-          <w:p>
-            <w:pPr>
-              <w:spacing w:after="0" w:line="220"/>
-            </w:pPr>
-            <w:r>
-              <w:rPr>
-                <w:rFonts w:ascii="Consolas" w:eastAsia="新細明體" w:hAnsi="Consolas"/>
-                <w:sz w:val="14"/>
-                <w:szCs w:val="14"/>
-              </w:rPr>
-              <w:t xml:space="preserve"> 21. cheese=TRUE crackers/miscellaneous baked food=TRUE packaged bread/buns/rolls=TRUE 216 ==&gt; fluid milk products=TRUE 162    &lt;conf:(0.75)&gt; lift:(2.77) lev:(0.01) [103] conv:(2.86)</w:t>
-            </w:r>
-          </w:p>
-          <w:p>
-            <w:pPr>
-              <w:spacing w:after="0" w:line="220"/>
-            </w:pPr>
-            <w:r>
-              <w:rPr>
-                <w:rFonts w:ascii="Consolas" w:eastAsia="新細明體" w:hAnsi="Consolas"/>
-                <w:sz w:val="14"/>
-                <w:szCs w:val="14"/>
-              </w:rPr>
-              <w:t xml:space="preserve"> 22. baked sweet goods=TRUE fluid milk products=TRUE soft drinks=TRUE 188 ==&gt; packaged bread/buns/rolls=TRUE 141    &lt;conf:(0.75)&gt; lift:(3.03) lev:(0.01) [94] conv:(2.95)</w:t>
-            </w:r>
-          </w:p>
-          <w:p>
-            <w:pPr>
-              <w:spacing w:after="0" w:line="220"/>
-            </w:pPr>
-            <w:r>
-              <w:rPr>
-                <w:rFonts w:ascii="Consolas" w:eastAsia="新細明體" w:hAnsi="Consolas"/>
-                <w:sz w:val="14"/>
-                <w:szCs w:val="14"/>
-              </w:rPr>
-              <w:t xml:space="preserve"> 23. deli counter meats=TRUE tropical fruit=TRUE 184 ==&gt; packaged bread/buns/rolls=TRUE 138    &lt;conf:(0.75)&gt; lift:(3.03) lev:(0.01) [92] conv:(2.95)</w:t>
-            </w:r>
-          </w:p>
-          <w:p>
-            <w:pPr>
-              <w:spacing w:after="0" w:line="220"/>
-            </w:pPr>
-            <w:r>
-              <w:rPr>
-                <w:rFonts w:ascii="Consolas" w:eastAsia="新細明體" w:hAnsi="Consolas"/>
-                <w:sz w:val="14"/>
-                <w:szCs w:val="14"/>
-              </w:rPr>
-              <w:t xml:space="preserve"> </w:t>
-            </w:r>
-          </w:p>
-          <w:p>
-            <w:pPr>
-              <w:spacing w:after="0" w:line="220"/>
-            </w:pPr>
-            <w:r>
-              <w:rPr>
-                <w:rFonts w:ascii="Consolas" w:eastAsia="新細明體" w:hAnsi="Consolas"/>
-                <w:sz w:val="14"/>
-                <w:szCs w:val="14"/>
-              </w:rPr>
-              <w:t xml:space="preserve">=== Evaluation ===</w:t>
-            </w:r>
-          </w:p>
-          <w:p>
-            <w:pPr>
-              <w:spacing w:after="0" w:line="220"/>
-            </w:pPr>
-            <w:r>
-              <w:rPr>
-                <w:rFonts w:ascii="Consolas" w:eastAsia="新細明體" w:hAnsi="Consolas"/>
-                <w:sz w:val="14"/>
-                <w:szCs w:val="14"/>
-              </w:rPr>
-              <w:t xml:space="preserve"> </w:t>
-            </w:r>
-          </w:p>
-          <w:p>
-            <w:pPr>
-              <w:spacing w:after="0" w:line="220"/>
-            </w:pPr>
-            <w:r>
-              <w:rPr>
-                <w:rFonts w:ascii="Consolas" w:eastAsia="新細明體" w:hAnsi="Consolas"/>
-                <w:sz w:val="14"/>
-                <w:szCs w:val="14"/>
-              </w:rPr>
-              <w:t xml:space="preserve">Elapsed time: 2.564s</w:t>
-            </w:r>
-          </w:p>
-        </w:tc>
-      </w:tr>
-    </w:tbl>
+    <w:p>
+      <w:pPr>
+        <w:spacing w:after="40" w:before="60"/>
+        <w:jc w:val="center"/>
+      </w:pPr>
+      <w:r>
+        <w:drawing>
+          <wp:inline distT="0" distB="0" distL="0" distR="0">
+            <wp:extent cx="6096000" cy="3952875"/>
+            <wp:effectExtent t="0" r="0" b="0" l="0"/>
+            <wp:docPr id="1" name="" descr="" title=""/>
+            <wp:cNvGraphicFramePr>
+              <a:graphicFrameLocks xmlns:a="http://schemas.openxmlformats.org/drawingml/2006/main" noChangeAspect="1"/>
+            </wp:cNvGraphicFramePr>
+            <a:graphic xmlns:a="http://schemas.openxmlformats.org/drawingml/2006/main">
+              <a:graphicData uri="http://schemas.openxmlformats.org/drawingml/2006/picture">
+                <pic:pic xmlns:pic="http://schemas.openxmlformats.org/drawingml/2006/picture">
+                  <pic:nvPicPr>
+                    <pic:cNvPr id="0" name="" descr=""/>
+                    <pic:cNvPicPr>
+                      <a:picLocks noChangeAspect="1" noChangeArrowheads="1"/>
+                    </pic:cNvPicPr>
+                  </pic:nvPicPr>
+                  <pic:blipFill>
+                    <a:blip r:embed="rId12" cstate="none"/>
+                    <a:srcRect/>
+                    <a:stretch>
+                      <a:fillRect/>
+                    </a:stretch>
+                  </pic:blipFill>
+                  <pic:spPr bwMode="auto">
+                    <a:xfrm>
+                      <a:off x="0" y="0"/>
+                      <a:ext cx="6096000" cy="3952875"/>
+                    </a:xfrm>
+                    <a:prstGeom prst="rect">
+                      <a:avLst/>
+                    </a:prstGeom>
+                  </pic:spPr>
+                </pic:pic>
+              </a:graphicData>
+            </a:graphic>
+          </wp:inline>
+        </w:drawing>
+      </w:r>
+    </w:p>
     <w:p>
       <w:pPr>
         <w:spacing w:after="160"/>
@@ -3768,7 +2489,7 @@
           <w:sz w:val="18"/>
           <w:szCs w:val="18"/>
         </w:rPr>
-        <w:t xml:space="preserve">圖 4　Q5 執行結果（規則 1、2 只有 3 項商品，規則 3 為第一條 4-itemset 規則）</w:t>
+        <w:t xml:space="preserve">圖 6　Q5 執行結果（規則 1、2 只有 3 項商品，規則 3 為第一條 4-itemset 規則）</w:t>
       </w:r>
     </w:p>
     <w:p>
@@ -3797,516 +2518,50 @@
     </w:p>
     <w:p>
       <w:pPr>
-        <w:pStyle w:val="Heading1"/>
-      </w:pPr>
-      <w:r>
-        <w:rPr>
-          <w:rFonts w:ascii="Times New Roman" w:eastAsia="新細明體" w:hAnsi="Times New Roman"/>
-        </w:rPr>
-        <w:t xml:space="preserve">Q6</w:t>
-      </w:r>
-    </w:p>
-    <w:p>
-      <w:pPr>
-        <w:spacing w:after="100" w:line="300"/>
-      </w:pPr>
-      <w:r>
-        <w:rPr>
-          <w:rFonts w:ascii="Times New Roman" w:eastAsia="新細明體" w:hAnsi="Times New Roman"/>
-        </w:rPr>
-        <w:t xml:space="preserve">參數：metric = Lift，minMetric = 3.0，lowerBoundMinSupport = 0.01，numRules = 10。support 下界比 Q3 稍高，以避免極少見的組合排在前面。</w:t>
-      </w:r>
-    </w:p>
-    <w:tbl>
-      <w:tblPr>
-        <w:tblW w:type="dxa" w:w="9638"/>
-        <w:tblBorders>
-          <w:top w:val="single" w:color="auto" w:sz="4"/>
-          <w:left w:val="single" w:color="auto" w:sz="4"/>
-          <w:bottom w:val="single" w:color="auto" w:sz="4"/>
-          <w:right w:val="single" w:color="auto" w:sz="4"/>
-          <w:insideH w:val="single" w:color="auto" w:sz="4"/>
-          <w:insideV w:val="single" w:color="auto" w:sz="4"/>
-        </w:tblBorders>
-      </w:tblPr>
-      <w:tblGrid>
-        <w:gridCol w:w="9638"/>
-      </w:tblGrid>
-      <w:tr>
-        <w:tc>
-          <w:tcPr>
-            <w:tcW w:type="dxa" w:w="9638"/>
-            <w:tcBorders>
-              <w:top w:val="single" w:color="000000" w:sz="4"/>
-              <w:left w:val="single" w:color="000000" w:sz="4"/>
-              <w:bottom w:val="single" w:color="000000" w:sz="4"/>
-              <w:right w:val="single" w:color="000000" w:sz="4"/>
-            </w:tcBorders>
-            <w:tcMar>
-              <w:top w:type="dxa" w:w="60"/>
-              <w:left w:type="dxa" w:w="100"/>
-              <w:bottom w:type="dxa" w:w="60"/>
-              <w:right w:type="dxa" w:w="100"/>
-            </w:tcMar>
-          </w:tcPr>
-          <w:p>
-            <w:pPr>
-              <w:spacing w:after="0" w:line="220"/>
-            </w:pPr>
-            <w:r>
-              <w:rPr>
-                <w:rFonts w:ascii="Consolas" w:eastAsia="新細明體" w:hAnsi="Consolas"/>
-                <w:sz w:val="14"/>
-                <w:szCs w:val="14"/>
-              </w:rPr>
-              <w:t xml:space="preserve">Apriori</w:t>
-            </w:r>
-          </w:p>
-          <w:p>
-            <w:pPr>
-              <w:spacing w:after="0" w:line="220"/>
-            </w:pPr>
-            <w:r>
-              <w:rPr>
-                <w:rFonts w:ascii="Consolas" w:eastAsia="新細明體" w:hAnsi="Consolas"/>
-                <w:sz w:val="14"/>
-                <w:szCs w:val="14"/>
-              </w:rPr>
-              <w:t xml:space="preserve">=======</w:t>
-            </w:r>
-          </w:p>
-          <w:p>
-            <w:pPr>
-              <w:spacing w:after="0" w:line="220"/>
-            </w:pPr>
-            <w:r>
-              <w:rPr>
-                <w:rFonts w:ascii="Consolas" w:eastAsia="新細明體" w:hAnsi="Consolas"/>
-                <w:sz w:val="14"/>
-                <w:szCs w:val="14"/>
-              </w:rPr>
-              <w:t xml:space="preserve"> </w:t>
-            </w:r>
-          </w:p>
-          <w:p>
-            <w:pPr>
-              <w:spacing w:after="0" w:line="220"/>
-            </w:pPr>
-            <w:r>
-              <w:rPr>
-                <w:rFonts w:ascii="Consolas" w:eastAsia="新細明體" w:hAnsi="Consolas"/>
-                <w:sz w:val="14"/>
-                <w:szCs w:val="14"/>
-              </w:rPr>
-              <w:t xml:space="preserve">Minimum support: 0.01 (80 instances)</w:t>
-            </w:r>
-          </w:p>
-          <w:p>
-            <w:pPr>
-              <w:spacing w:after="0" w:line="220"/>
-            </w:pPr>
-            <w:r>
-              <w:rPr>
-                <w:rFonts w:ascii="Consolas" w:eastAsia="新細明體" w:hAnsi="Consolas"/>
-                <w:sz w:val="14"/>
-                <w:szCs w:val="14"/>
-              </w:rPr>
-              <w:t xml:space="preserve">Minimum metric &lt;lift&gt;: 3</w:t>
-            </w:r>
-          </w:p>
-          <w:p>
-            <w:pPr>
-              <w:spacing w:after="0" w:line="220"/>
-            </w:pPr>
-            <w:r>
-              <w:rPr>
-                <w:rFonts w:ascii="Consolas" w:eastAsia="新細明體" w:hAnsi="Consolas"/>
-                <w:sz w:val="14"/>
-                <w:szCs w:val="14"/>
-              </w:rPr>
-              <w:t xml:space="preserve">Number of cycles performed: 20</w:t>
-            </w:r>
-          </w:p>
-          <w:p>
-            <w:pPr>
-              <w:spacing w:after="0" w:line="220"/>
-            </w:pPr>
-            <w:r>
-              <w:rPr>
-                <w:rFonts w:ascii="Consolas" w:eastAsia="新細明體" w:hAnsi="Consolas"/>
-                <w:sz w:val="14"/>
-                <w:szCs w:val="14"/>
-              </w:rPr>
-              <w:t xml:space="preserve"> </w:t>
-            </w:r>
-          </w:p>
-          <w:p>
-            <w:pPr>
-              <w:spacing w:after="0" w:line="220"/>
-            </w:pPr>
-            <w:r>
-              <w:rPr>
-                <w:rFonts w:ascii="Consolas" w:eastAsia="新細明體" w:hAnsi="Consolas"/>
-                <w:sz w:val="14"/>
-                <w:szCs w:val="14"/>
-              </w:rPr>
-              <w:t xml:space="preserve">Generated sets of large itemsets:</w:t>
-            </w:r>
-          </w:p>
-          <w:p>
-            <w:pPr>
-              <w:spacing w:after="0" w:line="220"/>
-            </w:pPr>
-            <w:r>
-              <w:rPr>
-                <w:rFonts w:ascii="Consolas" w:eastAsia="新細明體" w:hAnsi="Consolas"/>
-                <w:sz w:val="14"/>
-                <w:szCs w:val="14"/>
-              </w:rPr>
-              <w:t xml:space="preserve"> </w:t>
-            </w:r>
-          </w:p>
-          <w:p>
-            <w:pPr>
-              <w:spacing w:after="0" w:line="220"/>
-            </w:pPr>
-            <w:r>
-              <w:rPr>
-                <w:rFonts w:ascii="Consolas" w:eastAsia="新細明體" w:hAnsi="Consolas"/>
-                <w:sz w:val="14"/>
-                <w:szCs w:val="14"/>
-              </w:rPr>
-              <w:t xml:space="preserve">Size of set of large itemsets L(1): 120</w:t>
-            </w:r>
-          </w:p>
-          <w:p>
-            <w:pPr>
-              <w:spacing w:after="0" w:line="220"/>
-            </w:pPr>
-            <w:r>
-              <w:rPr>
-                <w:rFonts w:ascii="Consolas" w:eastAsia="新細明體" w:hAnsi="Consolas"/>
-                <w:sz w:val="14"/>
-                <w:szCs w:val="14"/>
-              </w:rPr>
-              <w:t xml:space="preserve"> </w:t>
-            </w:r>
-          </w:p>
-          <w:p>
-            <w:pPr>
-              <w:spacing w:after="0" w:line="220"/>
-            </w:pPr>
-            <w:r>
-              <w:rPr>
-                <w:rFonts w:ascii="Consolas" w:eastAsia="新細明體" w:hAnsi="Consolas"/>
-                <w:sz w:val="14"/>
-                <w:szCs w:val="14"/>
-              </w:rPr>
-              <w:t xml:space="preserve">Size of set of large itemsets L(2): 1229</w:t>
-            </w:r>
-          </w:p>
-          <w:p>
-            <w:pPr>
-              <w:spacing w:after="0" w:line="220"/>
-            </w:pPr>
-            <w:r>
-              <w:rPr>
-                <w:rFonts w:ascii="Consolas" w:eastAsia="新細明體" w:hAnsi="Consolas"/>
-                <w:sz w:val="14"/>
-                <w:szCs w:val="14"/>
-              </w:rPr>
-              <w:t xml:space="preserve"> </w:t>
-            </w:r>
-          </w:p>
-          <w:p>
-            <w:pPr>
-              <w:spacing w:after="0" w:line="220"/>
-            </w:pPr>
-            <w:r>
-              <w:rPr>
-                <w:rFonts w:ascii="Consolas" w:eastAsia="新細明體" w:hAnsi="Consolas"/>
-                <w:sz w:val="14"/>
-                <w:szCs w:val="14"/>
-              </w:rPr>
-              <w:t xml:space="preserve">Size of set of large itemsets L(3): 1469</w:t>
-            </w:r>
-          </w:p>
-          <w:p>
-            <w:pPr>
-              <w:spacing w:after="0" w:line="220"/>
-            </w:pPr>
-            <w:r>
-              <w:rPr>
-                <w:rFonts w:ascii="Consolas" w:eastAsia="新細明體" w:hAnsi="Consolas"/>
-                <w:sz w:val="14"/>
-                <w:szCs w:val="14"/>
-              </w:rPr>
-              <w:t xml:space="preserve"> </w:t>
-            </w:r>
-          </w:p>
-          <w:p>
-            <w:pPr>
-              <w:spacing w:after="0" w:line="220"/>
-            </w:pPr>
-            <w:r>
-              <w:rPr>
-                <w:rFonts w:ascii="Consolas" w:eastAsia="新細明體" w:hAnsi="Consolas"/>
-                <w:sz w:val="14"/>
-                <w:szCs w:val="14"/>
-              </w:rPr>
-              <w:t xml:space="preserve">Size of set of large itemsets L(4): 485</w:t>
-            </w:r>
-          </w:p>
-          <w:p>
-            <w:pPr>
-              <w:spacing w:after="0" w:line="220"/>
-            </w:pPr>
-            <w:r>
-              <w:rPr>
-                <w:rFonts w:ascii="Consolas" w:eastAsia="新細明體" w:hAnsi="Consolas"/>
-                <w:sz w:val="14"/>
-                <w:szCs w:val="14"/>
-              </w:rPr>
-              <w:t xml:space="preserve"> </w:t>
-            </w:r>
-          </w:p>
-          <w:p>
-            <w:pPr>
-              <w:spacing w:after="0" w:line="220"/>
-            </w:pPr>
-            <w:r>
-              <w:rPr>
-                <w:rFonts w:ascii="Consolas" w:eastAsia="新細明體" w:hAnsi="Consolas"/>
-                <w:sz w:val="14"/>
-                <w:szCs w:val="14"/>
-              </w:rPr>
-              <w:t xml:space="preserve">Size of set of large itemsets L(5): 41</w:t>
-            </w:r>
-          </w:p>
-          <w:p>
-            <w:pPr>
-              <w:spacing w:after="0" w:line="220"/>
-            </w:pPr>
-            <w:r>
-              <w:rPr>
-                <w:rFonts w:ascii="Consolas" w:eastAsia="新細明體" w:hAnsi="Consolas"/>
-                <w:sz w:val="14"/>
-                <w:szCs w:val="14"/>
-              </w:rPr>
-              <w:t xml:space="preserve"> </w:t>
-            </w:r>
-          </w:p>
-          <w:p>
-            <w:pPr>
-              <w:spacing w:after="0" w:line="220"/>
-            </w:pPr>
-            <w:r>
-              <w:rPr>
-                <w:rFonts w:ascii="Consolas" w:eastAsia="新細明體" w:hAnsi="Consolas"/>
-                <w:sz w:val="14"/>
-                <w:szCs w:val="14"/>
-              </w:rPr>
-              <w:t xml:space="preserve">Best rules found:</w:t>
-            </w:r>
-          </w:p>
-          <w:p>
-            <w:pPr>
-              <w:spacing w:after="0" w:line="220"/>
-            </w:pPr>
-            <w:r>
-              <w:rPr>
-                <w:rFonts w:ascii="Consolas" w:eastAsia="新細明體" w:hAnsi="Consolas"/>
-                <w:sz w:val="14"/>
-                <w:szCs w:val="14"/>
-              </w:rPr>
-              <w:t xml:space="preserve"> </w:t>
-            </w:r>
-          </w:p>
-          <w:p>
-            <w:pPr>
-              <w:spacing w:after="0" w:line="220"/>
-            </w:pPr>
-            <w:r>
-              <w:rPr>
-                <w:rFonts w:ascii="Consolas" w:eastAsia="新細明體" w:hAnsi="Consolas"/>
-                <w:sz w:val="14"/>
-                <w:szCs w:val="14"/>
-              </w:rPr>
-              <w:t xml:space="preserve"> 1. packaged bread/buns/rolls=TRUE pasta sauce=TRUE 229 ==&gt; beef=TRUE dry noodles/pasta=TRUE 82    conf:(0.36) &lt; lift:(16.56)&gt; lev:(0.01) [77] conv:(1.51)</w:t>
-            </w:r>
-          </w:p>
-          <w:p>
-            <w:pPr>
-              <w:spacing w:after="0" w:line="220"/>
-            </w:pPr>
-            <w:r>
-              <w:rPr>
-                <w:rFonts w:ascii="Consolas" w:eastAsia="新細明體" w:hAnsi="Consolas"/>
-                <w:sz w:val="14"/>
-                <w:szCs w:val="14"/>
-              </w:rPr>
-              <w:t xml:space="preserve"> 2. beef=TRUE dry noodles/pasta=TRUE 173 ==&gt; packaged bread/buns/rolls=TRUE pasta sauce=TRUE 82    conf:(0.47) &lt; lift:(16.56)&gt; lev:(0.01) [77] conv:(1.83)</w:t>
-            </w:r>
-          </w:p>
-          <w:p>
-            <w:pPr>
-              <w:spacing w:after="0" w:line="220"/>
-            </w:pPr>
-            <w:r>
-              <w:rPr>
-                <w:rFonts w:ascii="Consolas" w:eastAsia="新細明體" w:hAnsi="Consolas"/>
-                <w:sz w:val="14"/>
-                <w:szCs w:val="14"/>
-              </w:rPr>
-              <w:t xml:space="preserve"> 3. cheese=TRUE pasta sauce=TRUE 228 ==&gt; beef=TRUE dry noodles/pasta=TRUE 81    conf:(0.36) &lt; lift:(16.43)&gt; lev:(0.01) [76] conv:(1.51)</w:t>
-            </w:r>
-          </w:p>
-          <w:p>
-            <w:pPr>
-              <w:spacing w:after="0" w:line="220"/>
-            </w:pPr>
-            <w:r>
-              <w:rPr>
-                <w:rFonts w:ascii="Consolas" w:eastAsia="新細明體" w:hAnsi="Consolas"/>
-                <w:sz w:val="14"/>
-                <w:szCs w:val="14"/>
-              </w:rPr>
-              <w:t xml:space="preserve"> 4. beef=TRUE dry noodles/pasta=TRUE 173 ==&gt; cheese=TRUE pasta sauce=TRUE 81    conf:(0.47) &lt; lift:(16.43)&gt; lev:(0.01) [76] conv:(1.81)</w:t>
-            </w:r>
-          </w:p>
-          <w:p>
-            <w:pPr>
-              <w:spacing w:after="0" w:line="220"/>
-            </w:pPr>
-            <w:r>
-              <w:rPr>
-                <w:rFonts w:ascii="Consolas" w:eastAsia="新細明體" w:hAnsi="Consolas"/>
-                <w:sz w:val="14"/>
-                <w:szCs w:val="14"/>
-              </w:rPr>
-              <w:t xml:space="preserve"> 5. beef=TRUE pasta sauce=TRUE 194 ==&gt; cheese=TRUE dry noodles/pasta=TRUE 81    conf:(0.42) &lt; lift:(15.12)&gt; lev:(0.01) [75] conv:(1.65)</w:t>
-            </w:r>
-          </w:p>
-          <w:p>
-            <w:pPr>
-              <w:spacing w:after="0" w:line="220"/>
-            </w:pPr>
-            <w:r>
-              <w:rPr>
-                <w:rFonts w:ascii="Consolas" w:eastAsia="新細明體" w:hAnsi="Consolas"/>
-                <w:sz w:val="14"/>
-                <w:szCs w:val="14"/>
-              </w:rPr>
-              <w:t xml:space="preserve"> 6. cheese=TRUE dry noodles/pasta=TRUE 221 ==&gt; beef=TRUE pasta sauce=TRUE 81    conf:(0.37) &lt; lift:(15.12)&gt; lev:(0.01) [75] conv:(1.53)</w:t>
-            </w:r>
-          </w:p>
-          <w:p>
-            <w:pPr>
-              <w:spacing w:after="0" w:line="220"/>
-            </w:pPr>
-            <w:r>
-              <w:rPr>
-                <w:rFonts w:ascii="Consolas" w:eastAsia="新細明體" w:hAnsi="Consolas"/>
-                <w:sz w:val="14"/>
-                <w:szCs w:val="14"/>
-              </w:rPr>
-              <w:t xml:space="preserve"> 7. pasta sauce=TRUE 387 ==&gt; beef=TRUE dry noodles/pasta=TRUE packaged bread/buns/rolls=TRUE 82    conf:(0.21) &lt; lift:(14.62)&gt; lev:(0.01) [76] conv:(1.25)</w:t>
-            </w:r>
-          </w:p>
-          <w:p>
-            <w:pPr>
-              <w:spacing w:after="0" w:line="220"/>
-            </w:pPr>
-            <w:r>
-              <w:rPr>
-                <w:rFonts w:ascii="Consolas" w:eastAsia="新細明體" w:hAnsi="Consolas"/>
-                <w:sz w:val="14"/>
-                <w:szCs w:val="14"/>
-              </w:rPr>
-              <w:t xml:space="preserve"> 8. beef=TRUE dry noodles/pasta=TRUE packaged bread/buns/rolls=TRUE 116 ==&gt; pasta sauce=TRUE 82    conf:(0.71) &lt; lift:(14.62)&gt; lev:(0.01) [76] conv:(3.15)</w:t>
-            </w:r>
-          </w:p>
-          <w:p>
-            <w:pPr>
-              <w:spacing w:after="0" w:line="220"/>
-            </w:pPr>
-            <w:r>
-              <w:rPr>
-                <w:rFonts w:ascii="Consolas" w:eastAsia="新細明體" w:hAnsi="Consolas"/>
-                <w:sz w:val="14"/>
-                <w:szCs w:val="14"/>
-              </w:rPr>
-              <w:t xml:space="preserve"> 9. beef=TRUE pasta sauce=TRUE 194 ==&gt; dry noodles/pasta=TRUE packaged bread/buns/rolls=TRUE 82    conf:(0.42) &lt; lift:(14.45)&gt; lev:(0.01) [76] conv:(1.67)</w:t>
-            </w:r>
-          </w:p>
-          <w:p>
-            <w:pPr>
-              <w:spacing w:after="0" w:line="220"/>
-            </w:pPr>
-            <w:r>
-              <w:rPr>
-                <w:rFonts w:ascii="Consolas" w:eastAsia="新細明體" w:hAnsi="Consolas"/>
-                <w:sz w:val="14"/>
-                <w:szCs w:val="14"/>
-              </w:rPr>
-              <w:t xml:space="preserve">10. dry noodles/pasta=TRUE packaged bread/buns/rolls=TRUE 234 ==&gt; beef=TRUE pasta sauce=TRUE 82    conf:(0.35) &lt; lift:(14.45)&gt; lev:(0.01) [76] conv:(1.49)</w:t>
-            </w:r>
-          </w:p>
-          <w:p>
-            <w:pPr>
-              <w:spacing w:after="0" w:line="220"/>
-            </w:pPr>
-            <w:r>
-              <w:rPr>
-                <w:rFonts w:ascii="Consolas" w:eastAsia="新細明體" w:hAnsi="Consolas"/>
-                <w:sz w:val="14"/>
-                <w:szCs w:val="14"/>
-              </w:rPr>
-              <w:t xml:space="preserve"> </w:t>
-            </w:r>
-          </w:p>
-          <w:p>
-            <w:pPr>
-              <w:spacing w:after="0" w:line="220"/>
-            </w:pPr>
-            <w:r>
-              <w:rPr>
-                <w:rFonts w:ascii="Consolas" w:eastAsia="新細明體" w:hAnsi="Consolas"/>
-                <w:sz w:val="14"/>
-                <w:szCs w:val="14"/>
-              </w:rPr>
-              <w:t xml:space="preserve">=== Evaluation ===</w:t>
-            </w:r>
-          </w:p>
-          <w:p>
-            <w:pPr>
-              <w:spacing w:after="0" w:line="220"/>
-            </w:pPr>
-            <w:r>
-              <w:rPr>
-                <w:rFonts w:ascii="Consolas" w:eastAsia="新細明體" w:hAnsi="Consolas"/>
-                <w:sz w:val="14"/>
-                <w:szCs w:val="14"/>
-              </w:rPr>
-              <w:t xml:space="preserve"> </w:t>
-            </w:r>
-          </w:p>
-          <w:p>
-            <w:pPr>
-              <w:spacing w:after="0" w:line="220"/>
-            </w:pPr>
-            <w:r>
-              <w:rPr>
-                <w:rFonts w:ascii="Consolas" w:eastAsia="新細明體" w:hAnsi="Consolas"/>
-                <w:sz w:val="14"/>
-                <w:szCs w:val="14"/>
-              </w:rPr>
-              <w:t xml:space="preserve">Elapsed time: 12.4s</w:t>
-            </w:r>
-          </w:p>
-        </w:tc>
-      </w:tr>
-    </w:tbl>
+        <w:spacing w:after="40" w:before="60"/>
+        <w:jc w:val="center"/>
+      </w:pPr>
+      <w:r>
+        <w:drawing>
+          <wp:inline distT="0" distB="0" distL="0" distR="0">
+            <wp:extent cx="5715000" cy="2600325"/>
+            <wp:effectExtent t="0" r="0" b="0" l="0"/>
+            <wp:docPr id="1" name="" descr="" title=""/>
+            <wp:cNvGraphicFramePr>
+              <a:graphicFrameLocks xmlns:a="http://schemas.openxmlformats.org/drawingml/2006/main" noChangeAspect="1"/>
+            </wp:cNvGraphicFramePr>
+            <a:graphic xmlns:a="http://schemas.openxmlformats.org/drawingml/2006/main">
+              <a:graphicData uri="http://schemas.openxmlformats.org/drawingml/2006/picture">
+                <pic:pic xmlns:pic="http://schemas.openxmlformats.org/drawingml/2006/picture">
+                  <pic:nvPicPr>
+                    <pic:cNvPr id="0" name="" descr=""/>
+                    <pic:cNvPicPr>
+                      <a:picLocks noChangeAspect="1" noChangeArrowheads="1"/>
+                    </pic:cNvPicPr>
+                  </pic:nvPicPr>
+                  <pic:blipFill>
+                    <a:blip r:embed="rId13" cstate="none"/>
+                    <a:srcRect/>
+                    <a:stretch>
+                      <a:fillRect/>
+                    </a:stretch>
+                  </pic:blipFill>
+                  <pic:spPr bwMode="auto">
+                    <a:xfrm>
+                      <a:off x="0" y="0"/>
+                      <a:ext cx="5715000" cy="2600325"/>
+                    </a:xfrm>
+                    <a:prstGeom prst="rect">
+                      <a:avLst/>
+                    </a:prstGeom>
+                  </pic:spPr>
+                </pic:pic>
+              </a:graphicData>
+            </a:graphic>
+          </wp:inline>
+        </w:drawing>
+      </w:r>
+    </w:p>
     <w:p>
       <w:pPr>
         <w:spacing w:after="160"/>
@@ -4318,7 +2573,89 @@
           <w:sz w:val="18"/>
           <w:szCs w:val="18"/>
         </w:rPr>
-        <w:t xml:space="preserve">圖 5　Q6 執行結果</w:t>
+        <w:t xml:space="preserve">圖 7　q5_check.py</w:t>
+      </w:r>
+    </w:p>
+    <w:p>
+      <w:pPr>
+        <w:pStyle w:val="Heading1"/>
+      </w:pPr>
+      <w:r>
+        <w:rPr>
+          <w:rFonts w:ascii="Times New Roman" w:eastAsia="新細明體" w:hAnsi="Times New Roman"/>
+        </w:rPr>
+        <w:t xml:space="preserve">Q6</w:t>
+      </w:r>
+    </w:p>
+    <w:p>
+      <w:pPr>
+        <w:spacing w:after="100" w:line="300"/>
+      </w:pPr>
+      <w:r>
+        <w:rPr>
+          <w:rFonts w:ascii="Times New Roman" w:eastAsia="新細明體" w:hAnsi="Times New Roman"/>
+        </w:rPr>
+        <w:t xml:space="preserve">參數：metric = Lift，minMetric = 3.0，lowerBoundMinSupport = 0.01，numRules = 10。support 下界比 Q3 稍高，以避免極少見的組合排在前面。</w:t>
+      </w:r>
+    </w:p>
+    <w:p>
+      <w:pPr>
+        <w:spacing w:after="40" w:before="60"/>
+        <w:jc w:val="center"/>
+      </w:pPr>
+      <w:r>
+        <w:drawing>
+          <wp:inline distT="0" distB="0" distL="0" distR="0">
+            <wp:extent cx="6096000" cy="3600450"/>
+            <wp:effectExtent t="0" r="0" b="0" l="0"/>
+            <wp:docPr id="1" name="" descr="" title=""/>
+            <wp:cNvGraphicFramePr>
+              <a:graphicFrameLocks xmlns:a="http://schemas.openxmlformats.org/drawingml/2006/main" noChangeAspect="1"/>
+            </wp:cNvGraphicFramePr>
+            <a:graphic xmlns:a="http://schemas.openxmlformats.org/drawingml/2006/main">
+              <a:graphicData uri="http://schemas.openxmlformats.org/drawingml/2006/picture">
+                <pic:pic xmlns:pic="http://schemas.openxmlformats.org/drawingml/2006/picture">
+                  <pic:nvPicPr>
+                    <pic:cNvPr id="0" name="" descr=""/>
+                    <pic:cNvPicPr>
+                      <a:picLocks noChangeAspect="1" noChangeArrowheads="1"/>
+                    </pic:cNvPicPr>
+                  </pic:nvPicPr>
+                  <pic:blipFill>
+                    <a:blip r:embed="rId14" cstate="none"/>
+                    <a:srcRect/>
+                    <a:stretch>
+                      <a:fillRect/>
+                    </a:stretch>
+                  </pic:blipFill>
+                  <pic:spPr bwMode="auto">
+                    <a:xfrm>
+                      <a:off x="0" y="0"/>
+                      <a:ext cx="6096000" cy="3600450"/>
+                    </a:xfrm>
+                    <a:prstGeom prst="rect">
+                      <a:avLst/>
+                    </a:prstGeom>
+                  </pic:spPr>
+                </pic:pic>
+              </a:graphicData>
+            </a:graphic>
+          </wp:inline>
+        </w:drawing>
+      </w:r>
+    </w:p>
+    <w:p>
+      <w:pPr>
+        <w:spacing w:after="160"/>
+        <w:jc w:val="center"/>
+      </w:pPr>
+      <w:r>
+        <w:rPr>
+          <w:rFonts w:ascii="Times New Roman" w:eastAsia="新細明體" w:hAnsi="Times New Roman"/>
+          <w:sz w:val="18"/>
+          <w:szCs w:val="18"/>
+        </w:rPr>
+        <w:t xml:space="preserve">圖 8　Q6 執行結果</w:t>
       </w:r>
     </w:p>
     <w:p>
@@ -6614,7 +4951,7 @@
         <w:rPr>
           <w:rFonts w:ascii="Times New Roman" w:eastAsia="新細明體" w:hAnsi="Times New Roman"/>
         </w:rPr>
-        <w:t xml:space="preserve">工具：Weka 3.8.6 的 Apriori；Python 3 用於前處理（preprocess.py）與 Q5 驗證（q5_check.py）。</w:t>
+        <w:t xml:space="preserve">工具：Weka 3.8.6 Explorer 的 Apriori（Associate 頁面）；Python 3 用於前處理（preprocess.py）與 Q5 驗證（q5_check.py）。</w:t>
       </w:r>
     </w:p>
     <w:p>

</xml_diff>